<commit_message>
AI integration method documented
</commit_message>
<xml_diff>
--- a/Final Submission/COMP2003-Final Report.docx
+++ b/Final Submission/COMP2003-Final Report.docx
@@ -12,6 +12,15 @@
     </w:p>
     <w:sdt>
       <w:sdtPr>
+        <w:rPr>
+          <w:rFonts w:asciiTheme="minorHAnsi" w:eastAsiaTheme="minorHAnsi" w:hAnsiTheme="minorHAnsi" w:cstheme="minorBidi"/>
+          <w:color w:val="auto"/>
+          <w:kern w:val="2"/>
+          <w:sz w:val="24"/>
+          <w:szCs w:val="24"/>
+          <w:lang w:eastAsia="en-US"/>
+          <w14:ligatures w14:val="standardContextual"/>
+        </w:rPr>
         <w:id w:val="-2105485824"/>
         <w:docPartObj>
           <w:docPartGallery w:val="Table of Contents"/>
@@ -20,15 +29,8 @@
       </w:sdtPr>
       <w:sdtEndPr>
         <w:rPr>
-          <w:rFonts w:asciiTheme="minorHAnsi" w:eastAsiaTheme="minorHAnsi" w:hAnsiTheme="minorHAnsi" w:cstheme="minorBidi"/>
           <w:b/>
           <w:bCs/>
-          <w:color w:val="auto"/>
-          <w:kern w:val="2"/>
-          <w:sz w:val="24"/>
-          <w:szCs w:val="24"/>
-          <w:lang w:eastAsia="en-US"/>
-          <w14:ligatures w14:val="standardContextual"/>
         </w:rPr>
       </w:sdtEndPr>
       <w:sdtContent>
@@ -47,7 +49,9 @@
               <w:tab w:val="right" w:leader="dot" w:pos="9016"/>
             </w:tabs>
             <w:rPr>
+              <w:rFonts w:eastAsiaTheme="minorEastAsia"/>
               <w:noProof/>
+              <w:lang w:eastAsia="en-GB"/>
             </w:rPr>
           </w:pPr>
           <w:r>
@@ -59,7 +63,7 @@
           <w:r>
             <w:fldChar w:fldCharType="separate"/>
           </w:r>
-          <w:hyperlink w:anchor="_Toc227666171" w:history="1">
+          <w:hyperlink w:anchor="_Toc227768078" w:history="1">
             <w:r>
               <w:rPr>
                 <w:rStyle w:val="Hyperlink"/>
@@ -86,7 +90,7 @@
                 <w:noProof/>
                 <w:webHidden/>
               </w:rPr>
-              <w:instrText xml:space="preserve"> PAGEREF _Toc227666171 \h </w:instrText>
+              <w:instrText xml:space="preserve"> PAGEREF _Toc227768078 \h </w:instrText>
             </w:r>
             <w:r>
               <w:rPr>
@@ -124,10 +128,12 @@
               <w:tab w:val="right" w:leader="dot" w:pos="9016"/>
             </w:tabs>
             <w:rPr>
+              <w:rFonts w:eastAsiaTheme="minorEastAsia"/>
               <w:noProof/>
+              <w:lang w:eastAsia="en-GB"/>
             </w:rPr>
           </w:pPr>
-          <w:hyperlink w:anchor="_Toc227666172" w:history="1">
+          <w:hyperlink w:anchor="_Toc227768079" w:history="1">
             <w:r>
               <w:rPr>
                 <w:rStyle w:val="Hyperlink"/>
@@ -154,7 +160,7 @@
                 <w:noProof/>
                 <w:webHidden/>
               </w:rPr>
-              <w:instrText xml:space="preserve"> PAGEREF _Toc227666172 \h </w:instrText>
+              <w:instrText xml:space="preserve"> PAGEREF _Toc227768079 \h </w:instrText>
             </w:r>
             <w:r>
               <w:rPr>
@@ -192,10 +198,12 @@
               <w:tab w:val="right" w:leader="dot" w:pos="9016"/>
             </w:tabs>
             <w:rPr>
+              <w:rFonts w:eastAsiaTheme="minorEastAsia"/>
               <w:noProof/>
+              <w:lang w:eastAsia="en-GB"/>
             </w:rPr>
           </w:pPr>
-          <w:hyperlink w:anchor="_Toc227666173" w:history="1">
+          <w:hyperlink w:anchor="_Toc227768080" w:history="1">
             <w:r>
               <w:rPr>
                 <w:rStyle w:val="Hyperlink"/>
@@ -222,7 +230,7 @@
                 <w:noProof/>
                 <w:webHidden/>
               </w:rPr>
-              <w:instrText xml:space="preserve"> PAGEREF _Toc227666173 \h </w:instrText>
+              <w:instrText xml:space="preserve"> PAGEREF _Toc227768080 \h </w:instrText>
             </w:r>
             <w:r>
               <w:rPr>
@@ -242,7 +250,7 @@
                 <w:noProof/>
                 <w:webHidden/>
               </w:rPr>
-              <w:t>1</w:t>
+              <w:t>2</w:t>
             </w:r>
             <w:r>
               <w:rPr>
@@ -260,10 +268,12 @@
               <w:tab w:val="right" w:leader="dot" w:pos="9016"/>
             </w:tabs>
             <w:rPr>
+              <w:rFonts w:eastAsiaTheme="minorEastAsia"/>
               <w:noProof/>
+              <w:lang w:eastAsia="en-GB"/>
             </w:rPr>
           </w:pPr>
-          <w:hyperlink w:anchor="_Toc227666174" w:history="1">
+          <w:hyperlink w:anchor="_Toc227768081" w:history="1">
             <w:r>
               <w:rPr>
                 <w:rStyle w:val="Hyperlink"/>
@@ -290,7 +300,7 @@
                 <w:noProof/>
                 <w:webHidden/>
               </w:rPr>
-              <w:instrText xml:space="preserve"> PAGEREF _Toc227666174 \h </w:instrText>
+              <w:instrText xml:space="preserve"> PAGEREF _Toc227768081 \h </w:instrText>
             </w:r>
             <w:r>
               <w:rPr>
@@ -310,7 +320,217 @@
                 <w:noProof/>
                 <w:webHidden/>
               </w:rPr>
-              <w:t>1</w:t>
+              <w:t>2</w:t>
+            </w:r>
+            <w:r>
+              <w:rPr>
+                <w:noProof/>
+                <w:webHidden/>
+              </w:rPr>
+              <w:fldChar w:fldCharType="end"/>
+            </w:r>
+          </w:hyperlink>
+        </w:p>
+        <w:p>
+          <w:pPr>
+            <w:pStyle w:val="TOC2"/>
+            <w:tabs>
+              <w:tab w:val="right" w:leader="dot" w:pos="9016"/>
+            </w:tabs>
+            <w:rPr>
+              <w:rFonts w:eastAsiaTheme="minorEastAsia"/>
+              <w:noProof/>
+              <w:lang w:eastAsia="en-GB"/>
+            </w:rPr>
+          </w:pPr>
+          <w:hyperlink w:anchor="_Toc227768082" w:history="1">
+            <w:r>
+              <w:rPr>
+                <w:rStyle w:val="Hyperlink"/>
+                <w:noProof/>
+              </w:rPr>
+              <w:t>Diagrams</w:t>
+            </w:r>
+            <w:r>
+              <w:rPr>
+                <w:noProof/>
+                <w:webHidden/>
+              </w:rPr>
+              <w:tab/>
+            </w:r>
+            <w:r>
+              <w:rPr>
+                <w:noProof/>
+                <w:webHidden/>
+              </w:rPr>
+              <w:fldChar w:fldCharType="begin"/>
+            </w:r>
+            <w:r>
+              <w:rPr>
+                <w:noProof/>
+                <w:webHidden/>
+              </w:rPr>
+              <w:instrText xml:space="preserve"> PAGEREF _Toc227768082 \h </w:instrText>
+            </w:r>
+            <w:r>
+              <w:rPr>
+                <w:noProof/>
+                <w:webHidden/>
+              </w:rPr>
+            </w:r>
+            <w:r>
+              <w:rPr>
+                <w:noProof/>
+                <w:webHidden/>
+              </w:rPr>
+              <w:fldChar w:fldCharType="separate"/>
+            </w:r>
+            <w:r>
+              <w:rPr>
+                <w:noProof/>
+                <w:webHidden/>
+              </w:rPr>
+              <w:t>2</w:t>
+            </w:r>
+            <w:r>
+              <w:rPr>
+                <w:noProof/>
+                <w:webHidden/>
+              </w:rPr>
+              <w:fldChar w:fldCharType="end"/>
+            </w:r>
+          </w:hyperlink>
+        </w:p>
+        <w:p>
+          <w:pPr>
+            <w:pStyle w:val="TOC2"/>
+            <w:tabs>
+              <w:tab w:val="right" w:leader="dot" w:pos="9016"/>
+            </w:tabs>
+            <w:rPr>
+              <w:rFonts w:eastAsiaTheme="minorEastAsia"/>
+              <w:noProof/>
+              <w:lang w:eastAsia="en-GB"/>
+            </w:rPr>
+          </w:pPr>
+          <w:hyperlink w:anchor="_Toc227768083" w:history="1">
+            <w:r>
+              <w:rPr>
+                <w:rStyle w:val="Hyperlink"/>
+                <w:noProof/>
+              </w:rPr>
+              <w:t>Integration methods</w:t>
+            </w:r>
+            <w:r>
+              <w:rPr>
+                <w:noProof/>
+                <w:webHidden/>
+              </w:rPr>
+              <w:tab/>
+            </w:r>
+            <w:r>
+              <w:rPr>
+                <w:noProof/>
+                <w:webHidden/>
+              </w:rPr>
+              <w:fldChar w:fldCharType="begin"/>
+            </w:r>
+            <w:r>
+              <w:rPr>
+                <w:noProof/>
+                <w:webHidden/>
+              </w:rPr>
+              <w:instrText xml:space="preserve"> PAGEREF _Toc227768083 \h </w:instrText>
+            </w:r>
+            <w:r>
+              <w:rPr>
+                <w:noProof/>
+                <w:webHidden/>
+              </w:rPr>
+            </w:r>
+            <w:r>
+              <w:rPr>
+                <w:noProof/>
+                <w:webHidden/>
+              </w:rPr>
+              <w:fldChar w:fldCharType="separate"/>
+            </w:r>
+            <w:r>
+              <w:rPr>
+                <w:noProof/>
+                <w:webHidden/>
+              </w:rPr>
+              <w:t>2</w:t>
+            </w:r>
+            <w:r>
+              <w:rPr>
+                <w:noProof/>
+                <w:webHidden/>
+              </w:rPr>
+              <w:fldChar w:fldCharType="end"/>
+            </w:r>
+          </w:hyperlink>
+        </w:p>
+        <w:p>
+          <w:pPr>
+            <w:pStyle w:val="TOC3"/>
+            <w:tabs>
+              <w:tab w:val="right" w:leader="dot" w:pos="9016"/>
+            </w:tabs>
+            <w:rPr>
+              <w:rFonts w:eastAsiaTheme="minorEastAsia"/>
+              <w:noProof/>
+              <w:lang w:eastAsia="en-GB"/>
+            </w:rPr>
+          </w:pPr>
+          <w:hyperlink w:anchor="_Toc227768084" w:history="1">
+            <w:r>
+              <w:rPr>
+                <w:rStyle w:val="Hyperlink"/>
+                <w:noProof/>
+              </w:rPr>
+              <w:t>AI integration</w:t>
+            </w:r>
+            <w:r>
+              <w:rPr>
+                <w:noProof/>
+                <w:webHidden/>
+              </w:rPr>
+              <w:tab/>
+            </w:r>
+            <w:r>
+              <w:rPr>
+                <w:noProof/>
+                <w:webHidden/>
+              </w:rPr>
+              <w:fldChar w:fldCharType="begin"/>
+            </w:r>
+            <w:r>
+              <w:rPr>
+                <w:noProof/>
+                <w:webHidden/>
+              </w:rPr>
+              <w:instrText xml:space="preserve"> PAGEREF _Toc227768084 \h </w:instrText>
+            </w:r>
+            <w:r>
+              <w:rPr>
+                <w:noProof/>
+                <w:webHidden/>
+              </w:rPr>
+            </w:r>
+            <w:r>
+              <w:rPr>
+                <w:noProof/>
+                <w:webHidden/>
+              </w:rPr>
+              <w:fldChar w:fldCharType="separate"/>
+            </w:r>
+            <w:r>
+              <w:rPr>
+                <w:noProof/>
+                <w:webHidden/>
+              </w:rPr>
+              <w:t>2</w:t>
             </w:r>
             <w:r>
               <w:rPr>
@@ -328,10 +548,12 @@
               <w:tab w:val="right" w:leader="dot" w:pos="9016"/>
             </w:tabs>
             <w:rPr>
+              <w:rFonts w:eastAsiaTheme="minorEastAsia"/>
               <w:noProof/>
+              <w:lang w:eastAsia="en-GB"/>
             </w:rPr>
           </w:pPr>
-          <w:hyperlink w:anchor="_Toc227666175" w:history="1">
+          <w:hyperlink w:anchor="_Toc227768085" w:history="1">
             <w:r>
               <w:rPr>
                 <w:rStyle w:val="Hyperlink"/>
@@ -358,7 +580,7 @@
                 <w:noProof/>
                 <w:webHidden/>
               </w:rPr>
-              <w:instrText xml:space="preserve"> PAGEREF _Toc227666175 \h </w:instrText>
+              <w:instrText xml:space="preserve"> PAGEREF _Toc227768085 \h </w:instrText>
             </w:r>
             <w:r>
               <w:rPr>
@@ -378,7 +600,7 @@
                 <w:noProof/>
                 <w:webHidden/>
               </w:rPr>
-              <w:t>1</w:t>
+              <w:t>5</w:t>
             </w:r>
             <w:r>
               <w:rPr>
@@ -396,10 +618,12 @@
               <w:tab w:val="right" w:leader="dot" w:pos="9016"/>
             </w:tabs>
             <w:rPr>
+              <w:rFonts w:eastAsiaTheme="minorEastAsia"/>
               <w:noProof/>
+              <w:lang w:eastAsia="en-GB"/>
             </w:rPr>
           </w:pPr>
-          <w:hyperlink w:anchor="_Toc227666176" w:history="1">
+          <w:hyperlink w:anchor="_Toc227768086" w:history="1">
             <w:r>
               <w:rPr>
                 <w:rStyle w:val="Hyperlink"/>
@@ -426,7 +650,7 @@
                 <w:noProof/>
                 <w:webHidden/>
               </w:rPr>
-              <w:instrText xml:space="preserve"> PAGEREF _Toc227666176 \h </w:instrText>
+              <w:instrText xml:space="preserve"> PAGEREF _Toc227768086 \h </w:instrText>
             </w:r>
             <w:r>
               <w:rPr>
@@ -446,7 +670,7 @@
                 <w:noProof/>
                 <w:webHidden/>
               </w:rPr>
-              <w:t>1</w:t>
+              <w:t>5</w:t>
             </w:r>
             <w:r>
               <w:rPr>
@@ -464,10 +688,12 @@
               <w:tab w:val="right" w:leader="dot" w:pos="9016"/>
             </w:tabs>
             <w:rPr>
+              <w:rFonts w:eastAsiaTheme="minorEastAsia"/>
               <w:noProof/>
+              <w:lang w:eastAsia="en-GB"/>
             </w:rPr>
           </w:pPr>
-          <w:hyperlink w:anchor="_Toc227666177" w:history="1">
+          <w:hyperlink w:anchor="_Toc227768087" w:history="1">
             <w:r>
               <w:rPr>
                 <w:rStyle w:val="Hyperlink"/>
@@ -494,7 +720,7 @@
                 <w:noProof/>
                 <w:webHidden/>
               </w:rPr>
-              <w:instrText xml:space="preserve"> PAGEREF _Toc227666177 \h </w:instrText>
+              <w:instrText xml:space="preserve"> PAGEREF _Toc227768087 \h </w:instrText>
             </w:r>
             <w:r>
               <w:rPr>
@@ -514,7 +740,7 @@
                 <w:noProof/>
                 <w:webHidden/>
               </w:rPr>
-              <w:t>1</w:t>
+              <w:t>5</w:t>
             </w:r>
             <w:r>
               <w:rPr>
@@ -532,10 +758,12 @@
               <w:tab w:val="right" w:leader="dot" w:pos="9016"/>
             </w:tabs>
             <w:rPr>
+              <w:rFonts w:eastAsiaTheme="minorEastAsia"/>
               <w:noProof/>
+              <w:lang w:eastAsia="en-GB"/>
             </w:rPr>
           </w:pPr>
-          <w:hyperlink w:anchor="_Toc227666178" w:history="1">
+          <w:hyperlink w:anchor="_Toc227768088" w:history="1">
             <w:r>
               <w:rPr>
                 <w:rStyle w:val="Hyperlink"/>
@@ -562,7 +790,7 @@
                 <w:noProof/>
                 <w:webHidden/>
               </w:rPr>
-              <w:instrText xml:space="preserve"> PAGEREF _Toc227666178 \h </w:instrText>
+              <w:instrText xml:space="preserve"> PAGEREF _Toc227768088 \h </w:instrText>
             </w:r>
             <w:r>
               <w:rPr>
@@ -582,7 +810,7 @@
                 <w:noProof/>
                 <w:webHidden/>
               </w:rPr>
-              <w:t>1</w:t>
+              <w:t>5</w:t>
             </w:r>
             <w:r>
               <w:rPr>
@@ -613,7 +841,7 @@
       <w:pPr>
         <w:pStyle w:val="Heading1"/>
       </w:pPr>
-      <w:bookmarkStart w:id="0" w:name="_Toc227666171"/>
+      <w:bookmarkStart w:id="0" w:name="_Toc227768078"/>
       <w:r>
         <w:t>Main page</w:t>
       </w:r>
@@ -661,7 +889,7 @@
       <w:pPr>
         <w:pStyle w:val="Heading1"/>
       </w:pPr>
-      <w:bookmarkStart w:id="1" w:name="_Toc227666172"/>
+      <w:bookmarkStart w:id="1" w:name="_Toc227768079"/>
       <w:r>
         <w:t>Introduction</w:t>
       </w:r>
@@ -738,9 +966,8 @@
       <w:pPr>
         <w:pStyle w:val="Heading1"/>
       </w:pPr>
-      <w:bookmarkStart w:id="2" w:name="_Toc227666173"/>
-      <w:r>
-        <w:lastRenderedPageBreak/>
+      <w:bookmarkStart w:id="2" w:name="_Toc227768080"/>
+      <w:r>
         <w:t>Project Management</w:t>
       </w:r>
       <w:bookmarkEnd w:id="2"/>
@@ -835,7 +1062,7 @@
       <w:pPr>
         <w:pStyle w:val="Heading1"/>
       </w:pPr>
-      <w:bookmarkStart w:id="3" w:name="_Toc227666174"/>
+      <w:bookmarkStart w:id="3" w:name="_Toc227768081"/>
       <w:r>
         <w:t>Detailed System Design</w:t>
       </w:r>
@@ -845,9 +1072,11 @@
       <w:pPr>
         <w:pStyle w:val="Heading2"/>
       </w:pPr>
+      <w:bookmarkStart w:id="4" w:name="_Toc227768082"/>
       <w:r>
         <w:t>Diagrams</w:t>
       </w:r>
+      <w:bookmarkEnd w:id="4"/>
     </w:p>
     <w:p>
       <w:pPr>
@@ -950,9 +1179,11 @@
       <w:pPr>
         <w:pStyle w:val="Heading2"/>
       </w:pPr>
+      <w:bookmarkStart w:id="5" w:name="_Toc227768083"/>
       <w:r>
         <w:t>Integration methods</w:t>
       </w:r>
+      <w:bookmarkEnd w:id="5"/>
     </w:p>
     <w:p>
       <w:pPr>
@@ -1015,16 +1246,2374 @@
       </w:r>
     </w:p>
     <w:p/>
+    <w:p>
+      <w:pPr>
+        <w:pStyle w:val="Heading3"/>
+        <w:rPr>
+          <w:rStyle w:val="SubtleEmphasis"/>
+          <w:i w:val="0"/>
+          <w:iCs w:val="0"/>
+          <w:color w:val="0F4761" w:themeColor="accent1" w:themeShade="BF"/>
+        </w:rPr>
+      </w:pPr>
+      <w:bookmarkStart w:id="6" w:name="_Toc227768084"/>
+      <w:r>
+        <w:lastRenderedPageBreak/>
+        <w:t>AI integration</w:t>
+      </w:r>
+      <w:bookmarkEnd w:id="6"/>
+      <w:r>
+        <w:rPr>
+          <w:rStyle w:val="SubtleEmphasis"/>
+        </w:rPr>
+        <w:t xml:space="preserve">: </w:t>
+      </w:r>
+      <w:r>
+        <w:rPr>
+          <w:rStyle w:val="SubtleEmphasis"/>
+        </w:rPr>
+        <w:t>(Marc Jones)</w:t>
+      </w:r>
+    </w:p>
+    <w:p>
+      <w:pPr>
+        <w:rPr>
+          <w:rStyle w:val="SubtleEmphasis"/>
+          <w:i w:val="0"/>
+          <w:iCs w:val="0"/>
+        </w:rPr>
+      </w:pPr>
+      <w:r>
+        <w:rPr>
+          <w:rStyle w:val="SubtleEmphasis"/>
+          <w:i w:val="0"/>
+          <w:iCs w:val="0"/>
+        </w:rPr>
+        <w:tab/>
+        <w:t xml:space="preserve">All code relating to </w:t>
+      </w:r>
+      <w:r>
+        <w:rPr>
+          <w:rStyle w:val="SubtleEmphasis"/>
+          <w:i w:val="0"/>
+          <w:iCs w:val="0"/>
+        </w:rPr>
+        <w:t xml:space="preserve">the communication between </w:t>
+      </w:r>
+      <w:r>
+        <w:rPr>
+          <w:rStyle w:val="SubtleEmphasis"/>
+          <w:i w:val="0"/>
+          <w:iCs w:val="0"/>
+        </w:rPr>
+        <w:t xml:space="preserve">the website and AI model is contained within ‘Server.js’. </w:t>
+      </w:r>
+      <w:r>
+        <w:rPr>
+          <w:rStyle w:val="SubtleEmphasis"/>
+          <w:i w:val="0"/>
+          <w:iCs w:val="0"/>
+        </w:rPr>
+        <w:t>This is responsible for establishing the API connection</w:t>
+      </w:r>
+      <w:r>
+        <w:rPr>
+          <w:rStyle w:val="SubtleEmphasis"/>
+          <w:i w:val="0"/>
+          <w:iCs w:val="0"/>
+        </w:rPr>
+        <w:t xml:space="preserve">. </w:t>
+      </w:r>
+      <w:r>
+        <w:rPr>
+          <w:rStyle w:val="SubtleEmphasis"/>
+          <w:i w:val="0"/>
+          <w:iCs w:val="0"/>
+        </w:rPr>
+        <w:t>It mainly features the ‘post’ connection – sending the request</w:t>
+      </w:r>
+      <w:r>
+        <w:rPr>
+          <w:rStyle w:val="SubtleEmphasis"/>
+          <w:i w:val="0"/>
+          <w:iCs w:val="0"/>
+        </w:rPr>
+        <w:t xml:space="preserve">. </w:t>
+      </w:r>
+    </w:p>
+    <w:p>
+      <w:pPr>
+        <w:rPr>
+          <w:rStyle w:val="SubtleEmphasis"/>
+          <w:i w:val="0"/>
+          <w:iCs w:val="0"/>
+        </w:rPr>
+      </w:pPr>
+    </w:p>
+    <w:p>
+      <w:pPr>
+        <w:pStyle w:val="Heading4"/>
+      </w:pPr>
+      <w:r>
+        <w:t>Hosting</w:t>
+      </w:r>
+    </w:p>
+    <w:p>
+      <w:r>
+        <w:tab/>
+        <w:t>This section of our solution will be completed using  ‘</w:t>
+      </w:r>
+      <w:proofErr w:type="spellStart"/>
+      <w:r>
+        <w:t>Ollama</w:t>
+      </w:r>
+      <w:proofErr w:type="spellEnd"/>
+      <w:r>
+        <w:t>’. This program allows you to run and interact with larger AI models locally. This allows you to either use these models inside the application itself or interact with it via an API. Due to the models being run locally, this means data is kept private</w:t>
+      </w:r>
+    </w:p>
+    <w:p>
+      <w:r>
+        <w:tab/>
+        <w:t xml:space="preserve">In this case, we are using </w:t>
+      </w:r>
+      <w:proofErr w:type="spellStart"/>
+      <w:r>
+        <w:t>Ollama</w:t>
+      </w:r>
+      <w:proofErr w:type="spellEnd"/>
+      <w:r>
+        <w:t xml:space="preserve"> to run the model that connects to the backend of our website via its API using Node. The frontend of our website then communicates to this backend to allow for the user input a prompt and have the AI’s response sent back and displayed.</w:t>
+      </w:r>
+    </w:p>
+    <w:p>
+      <w:r>
+        <w:tab/>
+        <w:t xml:space="preserve">Currently, </w:t>
+      </w:r>
+      <w:proofErr w:type="spellStart"/>
+      <w:r>
+        <w:t>Ollama</w:t>
+      </w:r>
+      <w:proofErr w:type="spellEnd"/>
+      <w:r>
+        <w:t xml:space="preserve"> is hosted on the HTTP API 127.0.0.1:11434. This should be kept in consideration when connecting to the backend.</w:t>
+      </w:r>
+    </w:p>
+    <w:p>
+      <w:r>
+        <w:rPr>
+          <w:noProof/>
+        </w:rPr>
+        <w:drawing>
+          <wp:inline distT="0" distB="0" distL="0" distR="0" wp14:anchorId="313ECFFF" wp14:editId="51BE25E1">
+            <wp:extent cx="5731510" cy="1258570"/>
+            <wp:effectExtent l="0" t="0" r="2540" b="0"/>
+            <wp:docPr id="1144025332" name="Picture 1" descr="A screen shot of a computer&#10;&#10;AI-generated content may be incorrect."/>
+            <wp:cNvGraphicFramePr>
+              <a:graphicFrameLocks xmlns:a="http://schemas.openxmlformats.org/drawingml/2006/main" noChangeAspect="1"/>
+            </wp:cNvGraphicFramePr>
+            <a:graphic xmlns:a="http://schemas.openxmlformats.org/drawingml/2006/main">
+              <a:graphicData uri="http://schemas.openxmlformats.org/drawingml/2006/picture">
+                <pic:pic xmlns:pic="http://schemas.openxmlformats.org/drawingml/2006/picture">
+                  <pic:nvPicPr>
+                    <pic:cNvPr id="1144025332" name="Picture 1" descr="A screen shot of a computer&#10;&#10;AI-generated content may be incorrect."/>
+                    <pic:cNvPicPr/>
+                  </pic:nvPicPr>
+                  <pic:blipFill>
+                    <a:blip r:embed="rId6"/>
+                    <a:stretch>
+                      <a:fillRect/>
+                    </a:stretch>
+                  </pic:blipFill>
+                  <pic:spPr>
+                    <a:xfrm>
+                      <a:off x="0" y="0"/>
+                      <a:ext cx="5731510" cy="1258570"/>
+                    </a:xfrm>
+                    <a:prstGeom prst="rect">
+                      <a:avLst/>
+                    </a:prstGeom>
+                  </pic:spPr>
+                </pic:pic>
+              </a:graphicData>
+            </a:graphic>
+          </wp:inline>
+        </w:drawing>
+      </w:r>
+    </w:p>
+    <w:p>
+      <w:pPr>
+        <w:rPr>
+          <w:rStyle w:val="SubtleEmphasis"/>
+        </w:rPr>
+      </w:pPr>
+      <w:r>
+        <w:rPr>
+          <w:rStyle w:val="SubtleEmphasis"/>
+        </w:rPr>
+        <w:t>Figure</w:t>
+      </w:r>
+      <w:r>
+        <w:rPr>
+          <w:rStyle w:val="SubtleEmphasis"/>
+        </w:rPr>
+        <w:t xml:space="preserve">1 </w:t>
+      </w:r>
+      <w:r>
+        <w:rPr>
+          <w:rStyle w:val="SubtleEmphasis"/>
+        </w:rPr>
+        <w:t>–</w:t>
+      </w:r>
+      <w:r>
+        <w:rPr>
+          <w:rStyle w:val="SubtleEmphasis"/>
+        </w:rPr>
+        <w:t xml:space="preserve"> </w:t>
+      </w:r>
+      <w:r>
+        <w:rPr>
+          <w:rStyle w:val="SubtleEmphasis"/>
+        </w:rPr>
+        <w:t xml:space="preserve"> AI website structure</w:t>
+      </w:r>
+    </w:p>
+    <w:p>
+      <w:pPr>
+        <w:rPr>
+          <w:rStyle w:val="SubtleEmphasis"/>
+        </w:rPr>
+      </w:pPr>
+    </w:p>
+    <w:p>
+      <w:pPr>
+        <w:pStyle w:val="Heading4"/>
+      </w:pPr>
+      <w:r>
+        <w:t>AI model</w:t>
+      </w:r>
+    </w:p>
+    <w:p>
+      <w:r>
+        <w:tab/>
+      </w:r>
+      <w:r>
+        <w:t>We are</w:t>
+      </w:r>
+      <w:r>
+        <w:t xml:space="preserve"> currently using </w:t>
+      </w:r>
+      <w:r>
+        <w:t>Google’s</w:t>
+      </w:r>
+      <w:r>
+        <w:t xml:space="preserve"> Gemma3. Gemma is a lightweight set of models built on Gemini technology.  This can handle text and image processing – in over 140 native languages. This makes our website more available to other users across the globe (should it be shipped to do so). All model sizes excel in tasks like question answering, summarising and reasoning. It does all this using a very compact structure meaning it can run on a wide range of devices.</w:t>
+      </w:r>
+    </w:p>
+    <w:p>
+      <w:r>
+        <w:tab/>
+        <w:t xml:space="preserve">After some testing with Gemma, I ultimately decided that Gemma3-4b would be the most suitable. This is the mid-range solution of their models. I attempted to use Gemma3-1b initially but found its responses to be very slightly unsuitable due to a slight bit of inconsistency. These responses were </w:t>
+      </w:r>
+      <w:r>
+        <w:t xml:space="preserve">more accurate </w:t>
+      </w:r>
+      <w:r>
+        <w:t>given the size of the model and could be suitable for running locally on almost any devices</w:t>
+      </w:r>
+      <w:r>
+        <w:t>, should it need to</w:t>
+      </w:r>
+      <w:r>
+        <w:t xml:space="preserve">. I have </w:t>
+      </w:r>
+      <w:r>
+        <w:lastRenderedPageBreak/>
+        <w:t xml:space="preserve">found Gemma3-4b to be the best of the options – giving </w:t>
+      </w:r>
+      <w:r>
+        <w:t>acceptable</w:t>
+      </w:r>
+      <w:r>
+        <w:t>, consistent responses whilst remaining on a small scale and providing very quick responses. Anything bigger than 4b would be insignificant due to the nature of the prompts it is needed for.</w:t>
+      </w:r>
+    </w:p>
     <w:p/>
     <w:p>
       <w:pPr>
+        <w:pStyle w:val="Heading4"/>
+      </w:pPr>
+      <w:r>
+        <w:t>Prompts</w:t>
+      </w:r>
+    </w:p>
+    <w:p>
+      <w:r>
+        <w:tab/>
+        <w:t xml:space="preserve">This model is going to serve one very specific purpose. Generating questions and answers. To make results consistent and user friendly, a generic prompt ‘template’ will be used (within the backend of the website structure). Here, a user (in this case, a teacher) will simply input a topic that they would like to answer questions about and press generate. This will then produce a given number of </w:t>
+      </w:r>
+      <w:r>
+        <w:t>multiple-choice</w:t>
+      </w:r>
+      <w:r>
+        <w:t xml:space="preserve"> questions on said topic. </w:t>
+      </w:r>
+    </w:p>
+    <w:p>
+      <w:r>
+        <w:tab/>
+        <w:t xml:space="preserve">The output of this prompt is given in a JSON format so that these questions can be easily managed by the larger server structure and be saved on the user’s device (locally) to be used </w:t>
+      </w:r>
+      <w:proofErr w:type="gramStart"/>
+      <w:r>
+        <w:t>at a later date</w:t>
+      </w:r>
+      <w:proofErr w:type="gramEnd"/>
+      <w:r>
+        <w:t>.</w:t>
+      </w:r>
+    </w:p>
+    <w:p>
+      <w:r>
+        <w:tab/>
+        <w:t>Currently, the prompt is as shows:</w:t>
+      </w:r>
+    </w:p>
+    <w:p>
+      <w:pPr>
+        <w:shd w:val="clear" w:color="auto" w:fill="000000" w:themeFill="text1"/>
+        <w:spacing w:after="0" w:line="240" w:lineRule="auto"/>
+        <w:rPr>
+          <w:rFonts w:ascii="Consolas" w:hAnsi="Consolas"/>
+          <w:color w:val="EB7A41"/>
+          <w:sz w:val="20"/>
+          <w:szCs w:val="20"/>
+        </w:rPr>
+      </w:pPr>
+      <w:r>
+        <w:rPr>
+          <w:rFonts w:ascii="Consolas" w:hAnsi="Consolas"/>
+          <w:color w:val="215E99" w:themeColor="text2" w:themeTint="BF"/>
+          <w:sz w:val="20"/>
+          <w:szCs w:val="20"/>
+        </w:rPr>
+        <w:t xml:space="preserve">const </w:t>
+      </w:r>
+      <w:r>
+        <w:rPr>
+          <w:rFonts w:ascii="Consolas" w:hAnsi="Consolas"/>
+          <w:color w:val="A5C9EB" w:themeColor="text2" w:themeTint="40"/>
+          <w:sz w:val="20"/>
+          <w:szCs w:val="20"/>
+        </w:rPr>
+        <w:t xml:space="preserve">basePrompt </w:t>
+      </w:r>
+      <w:r>
+        <w:rPr>
+          <w:rFonts w:ascii="Consolas" w:hAnsi="Consolas"/>
+          <w:sz w:val="20"/>
+          <w:szCs w:val="20"/>
+        </w:rPr>
+        <w:t xml:space="preserve">= </w:t>
+      </w:r>
+      <w:r>
+        <w:rPr>
+          <w:rFonts w:ascii="Consolas" w:hAnsi="Consolas"/>
+          <w:color w:val="EB7A41"/>
+          <w:sz w:val="20"/>
+          <w:szCs w:val="20"/>
+        </w:rPr>
+        <w:t>`</w:t>
+      </w:r>
+    </w:p>
+    <w:p>
+      <w:pPr>
+        <w:shd w:val="clear" w:color="auto" w:fill="000000" w:themeFill="text1"/>
+        <w:spacing w:after="0" w:line="240" w:lineRule="auto"/>
+        <w:rPr>
+          <w:rFonts w:ascii="Consolas" w:hAnsi="Consolas"/>
+          <w:color w:val="EB7A41"/>
+          <w:sz w:val="20"/>
+          <w:szCs w:val="20"/>
+        </w:rPr>
+      </w:pPr>
+      <w:r>
+        <w:rPr>
+          <w:rFonts w:ascii="Consolas" w:hAnsi="Consolas"/>
+          <w:color w:val="EB7A41"/>
+          <w:sz w:val="20"/>
+          <w:szCs w:val="20"/>
+        </w:rPr>
+        <w:t>You are a teacher providing multiple choice questions to students.</w:t>
+      </w:r>
+    </w:p>
+    <w:p>
+      <w:pPr>
+        <w:shd w:val="clear" w:color="auto" w:fill="000000" w:themeFill="text1"/>
+        <w:spacing w:after="0" w:line="240" w:lineRule="auto"/>
+        <w:rPr>
+          <w:rFonts w:ascii="Consolas" w:hAnsi="Consolas"/>
+          <w:color w:val="EB7A41"/>
+          <w:sz w:val="20"/>
+          <w:szCs w:val="20"/>
+        </w:rPr>
+      </w:pPr>
+      <w:r>
+        <w:rPr>
+          <w:rFonts w:ascii="Consolas" w:hAnsi="Consolas"/>
+          <w:color w:val="EB7A41"/>
+          <w:sz w:val="20"/>
+          <w:szCs w:val="20"/>
+        </w:rPr>
+        <w:t>Generate 8 questions on the following topic, this should be in a valid JSON format using the following question template:</w:t>
+      </w:r>
+    </w:p>
+    <w:p>
+      <w:pPr>
+        <w:shd w:val="clear" w:color="auto" w:fill="000000" w:themeFill="text1"/>
+        <w:spacing w:after="0" w:line="240" w:lineRule="auto"/>
+        <w:rPr>
+          <w:rFonts w:ascii="Consolas" w:hAnsi="Consolas"/>
+          <w:color w:val="EB7A41"/>
+          <w:sz w:val="20"/>
+          <w:szCs w:val="20"/>
+        </w:rPr>
+      </w:pPr>
+      <w:r>
+        <w:rPr>
+          <w:rFonts w:ascii="Consolas" w:hAnsi="Consolas"/>
+          <w:color w:val="EB7A41"/>
+          <w:sz w:val="20"/>
+          <w:szCs w:val="20"/>
+        </w:rPr>
+        <w:t>    {</w:t>
+      </w:r>
+    </w:p>
+    <w:p>
+      <w:pPr>
+        <w:shd w:val="clear" w:color="auto" w:fill="000000" w:themeFill="text1"/>
+        <w:spacing w:after="0" w:line="240" w:lineRule="auto"/>
+        <w:rPr>
+          <w:rFonts w:ascii="Consolas" w:hAnsi="Consolas"/>
+          <w:color w:val="EB7A41"/>
+          <w:sz w:val="20"/>
+          <w:szCs w:val="20"/>
+        </w:rPr>
+      </w:pPr>
+      <w:r>
+        <w:rPr>
+          <w:rFonts w:ascii="Consolas" w:hAnsi="Consolas"/>
+          <w:color w:val="EB7A41"/>
+          <w:sz w:val="20"/>
+          <w:szCs w:val="20"/>
+        </w:rPr>
+        <w:t>    "0": {</w:t>
+      </w:r>
+    </w:p>
+    <w:p>
+      <w:pPr>
+        <w:shd w:val="clear" w:color="auto" w:fill="000000" w:themeFill="text1"/>
+        <w:spacing w:after="0" w:line="240" w:lineRule="auto"/>
+        <w:rPr>
+          <w:rFonts w:ascii="Consolas" w:hAnsi="Consolas"/>
+          <w:color w:val="EB7A41"/>
+          <w:sz w:val="20"/>
+          <w:szCs w:val="20"/>
+        </w:rPr>
+      </w:pPr>
+      <w:r>
+        <w:rPr>
+          <w:rFonts w:ascii="Consolas" w:hAnsi="Consolas"/>
+          <w:color w:val="EB7A41"/>
+          <w:sz w:val="20"/>
+          <w:szCs w:val="20"/>
+        </w:rPr>
+        <w:t>        "question": "Question text here",</w:t>
+      </w:r>
+    </w:p>
+    <w:p>
+      <w:pPr>
+        <w:shd w:val="clear" w:color="auto" w:fill="000000" w:themeFill="text1"/>
+        <w:spacing w:after="0" w:line="240" w:lineRule="auto"/>
+        <w:rPr>
+          <w:rFonts w:ascii="Consolas" w:hAnsi="Consolas"/>
+          <w:color w:val="EB7A41"/>
+          <w:sz w:val="20"/>
+          <w:szCs w:val="20"/>
+        </w:rPr>
+      </w:pPr>
+      <w:r>
+        <w:rPr>
+          <w:rFonts w:ascii="Consolas" w:hAnsi="Consolas"/>
+          <w:color w:val="EB7A41"/>
+          <w:sz w:val="20"/>
+          <w:szCs w:val="20"/>
+        </w:rPr>
+        <w:t>        "answers": [</w:t>
+      </w:r>
+    </w:p>
+    <w:p>
+      <w:pPr>
+        <w:shd w:val="clear" w:color="auto" w:fill="000000" w:themeFill="text1"/>
+        <w:spacing w:after="0" w:line="240" w:lineRule="auto"/>
+        <w:rPr>
+          <w:rFonts w:ascii="Consolas" w:hAnsi="Consolas"/>
+          <w:color w:val="EB7A41"/>
+          <w:sz w:val="20"/>
+          <w:szCs w:val="20"/>
+        </w:rPr>
+      </w:pPr>
+      <w:r>
+        <w:rPr>
+          <w:rFonts w:ascii="Consolas" w:hAnsi="Consolas"/>
+          <w:color w:val="EB7A41"/>
+          <w:sz w:val="20"/>
+          <w:szCs w:val="20"/>
+        </w:rPr>
+        <w:t>        "Answer 1",</w:t>
+      </w:r>
+    </w:p>
+    <w:p>
+      <w:pPr>
+        <w:shd w:val="clear" w:color="auto" w:fill="000000" w:themeFill="text1"/>
+        <w:spacing w:after="0" w:line="240" w:lineRule="auto"/>
+        <w:rPr>
+          <w:rFonts w:ascii="Consolas" w:hAnsi="Consolas"/>
+          <w:color w:val="EB7A41"/>
+          <w:sz w:val="20"/>
+          <w:szCs w:val="20"/>
+        </w:rPr>
+      </w:pPr>
+      <w:r>
+        <w:rPr>
+          <w:rFonts w:ascii="Consolas" w:hAnsi="Consolas"/>
+          <w:color w:val="EB7A41"/>
+          <w:sz w:val="20"/>
+          <w:szCs w:val="20"/>
+        </w:rPr>
+        <w:t>        "Answer 2",</w:t>
+      </w:r>
+    </w:p>
+    <w:p>
+      <w:pPr>
+        <w:shd w:val="clear" w:color="auto" w:fill="000000" w:themeFill="text1"/>
+        <w:spacing w:after="0" w:line="240" w:lineRule="auto"/>
+        <w:rPr>
+          <w:rFonts w:ascii="Consolas" w:hAnsi="Consolas"/>
+          <w:color w:val="EB7A41"/>
+          <w:sz w:val="20"/>
+          <w:szCs w:val="20"/>
+        </w:rPr>
+      </w:pPr>
+      <w:r>
+        <w:rPr>
+          <w:rFonts w:ascii="Consolas" w:hAnsi="Consolas"/>
+          <w:color w:val="EB7A41"/>
+          <w:sz w:val="20"/>
+          <w:szCs w:val="20"/>
+        </w:rPr>
+        <w:t>        "Answer 3",</w:t>
+      </w:r>
+    </w:p>
+    <w:p>
+      <w:pPr>
+        <w:shd w:val="clear" w:color="auto" w:fill="000000" w:themeFill="text1"/>
+        <w:spacing w:after="0" w:line="240" w:lineRule="auto"/>
+        <w:rPr>
+          <w:rFonts w:ascii="Consolas" w:hAnsi="Consolas"/>
+          <w:color w:val="EB7A41"/>
+          <w:sz w:val="20"/>
+          <w:szCs w:val="20"/>
+        </w:rPr>
+      </w:pPr>
+      <w:r>
+        <w:rPr>
+          <w:rFonts w:ascii="Consolas" w:hAnsi="Consolas"/>
+          <w:color w:val="EB7A41"/>
+          <w:sz w:val="20"/>
+          <w:szCs w:val="20"/>
+        </w:rPr>
+        <w:t>        "Answer 4"</w:t>
+      </w:r>
+    </w:p>
+    <w:p>
+      <w:pPr>
+        <w:shd w:val="clear" w:color="auto" w:fill="000000" w:themeFill="text1"/>
+        <w:spacing w:after="0" w:line="240" w:lineRule="auto"/>
+        <w:rPr>
+          <w:rFonts w:ascii="Consolas" w:hAnsi="Consolas"/>
+          <w:color w:val="EB7A41"/>
+          <w:sz w:val="20"/>
+          <w:szCs w:val="20"/>
+        </w:rPr>
+      </w:pPr>
+      <w:r>
+        <w:rPr>
+          <w:rFonts w:ascii="Consolas" w:hAnsi="Consolas"/>
+          <w:color w:val="EB7A41"/>
+          <w:sz w:val="20"/>
+          <w:szCs w:val="20"/>
+        </w:rPr>
+        <w:t>        ],</w:t>
+      </w:r>
+    </w:p>
+    <w:p>
+      <w:pPr>
+        <w:shd w:val="clear" w:color="auto" w:fill="000000" w:themeFill="text1"/>
+        <w:spacing w:after="0" w:line="240" w:lineRule="auto"/>
+        <w:rPr>
+          <w:rFonts w:ascii="Consolas" w:hAnsi="Consolas"/>
+          <w:color w:val="EB7A41"/>
+          <w:sz w:val="20"/>
+          <w:szCs w:val="20"/>
+        </w:rPr>
+      </w:pPr>
+      <w:r>
+        <w:rPr>
+          <w:rFonts w:ascii="Consolas" w:hAnsi="Consolas"/>
+          <w:color w:val="EB7A41"/>
+          <w:sz w:val="20"/>
+          <w:szCs w:val="20"/>
+        </w:rPr>
+        <w:t>        "</w:t>
+      </w:r>
+      <w:proofErr w:type="spellStart"/>
+      <w:r>
+        <w:rPr>
+          <w:rFonts w:ascii="Consolas" w:hAnsi="Consolas"/>
+          <w:color w:val="EB7A41"/>
+          <w:sz w:val="20"/>
+          <w:szCs w:val="20"/>
+        </w:rPr>
+        <w:t>correctAns</w:t>
+      </w:r>
+      <w:proofErr w:type="spellEnd"/>
+      <w:r>
+        <w:rPr>
+          <w:rFonts w:ascii="Consolas" w:hAnsi="Consolas"/>
+          <w:color w:val="EB7A41"/>
+          <w:sz w:val="20"/>
+          <w:szCs w:val="20"/>
+        </w:rPr>
+        <w:t>": "The correct answer text here"</w:t>
+      </w:r>
+    </w:p>
+    <w:p>
+      <w:pPr>
+        <w:shd w:val="clear" w:color="auto" w:fill="000000" w:themeFill="text1"/>
+        <w:spacing w:after="0" w:line="240" w:lineRule="auto"/>
+        <w:rPr>
+          <w:rFonts w:ascii="Consolas" w:hAnsi="Consolas"/>
+          <w:color w:val="EB7A41"/>
+          <w:sz w:val="20"/>
+          <w:szCs w:val="20"/>
+        </w:rPr>
+      </w:pPr>
+      <w:r>
+        <w:rPr>
+          <w:rFonts w:ascii="Consolas" w:hAnsi="Consolas"/>
+          <w:color w:val="EB7A41"/>
+          <w:sz w:val="20"/>
+          <w:szCs w:val="20"/>
+        </w:rPr>
+        <w:t>    },</w:t>
+      </w:r>
+    </w:p>
+    <w:p>
+      <w:pPr>
+        <w:shd w:val="clear" w:color="auto" w:fill="000000" w:themeFill="text1"/>
+        <w:spacing w:after="0" w:line="240" w:lineRule="auto"/>
+        <w:rPr>
+          <w:rFonts w:ascii="Consolas" w:hAnsi="Consolas"/>
+          <w:color w:val="EB7A41"/>
+          <w:sz w:val="20"/>
+          <w:szCs w:val="20"/>
+        </w:rPr>
+      </w:pPr>
+      <w:r>
+        <w:rPr>
+          <w:rFonts w:ascii="Consolas" w:hAnsi="Consolas"/>
+          <w:color w:val="EB7A41"/>
+          <w:sz w:val="20"/>
+          <w:szCs w:val="20"/>
+        </w:rPr>
+        <w:t>    "1": {</w:t>
+      </w:r>
+    </w:p>
+    <w:p>
+      <w:pPr>
+        <w:shd w:val="clear" w:color="auto" w:fill="000000" w:themeFill="text1"/>
+        <w:spacing w:after="0" w:line="240" w:lineRule="auto"/>
+        <w:rPr>
+          <w:rFonts w:ascii="Consolas" w:hAnsi="Consolas"/>
+          <w:color w:val="EB7A41"/>
+          <w:sz w:val="20"/>
+          <w:szCs w:val="20"/>
+        </w:rPr>
+      </w:pPr>
+      <w:r>
+        <w:rPr>
+          <w:rFonts w:ascii="Consolas" w:hAnsi="Consolas"/>
+          <w:color w:val="EB7A41"/>
+          <w:sz w:val="20"/>
+          <w:szCs w:val="20"/>
+        </w:rPr>
+        <w:t>        "question": "Question text here",</w:t>
+      </w:r>
+    </w:p>
+    <w:p>
+      <w:pPr>
+        <w:shd w:val="clear" w:color="auto" w:fill="000000" w:themeFill="text1"/>
+        <w:spacing w:after="0" w:line="240" w:lineRule="auto"/>
+        <w:rPr>
+          <w:rFonts w:ascii="Consolas" w:hAnsi="Consolas"/>
+          <w:color w:val="EB7A41"/>
+          <w:sz w:val="20"/>
+          <w:szCs w:val="20"/>
+        </w:rPr>
+      </w:pPr>
+      <w:r>
+        <w:rPr>
+          <w:rFonts w:ascii="Consolas" w:hAnsi="Consolas"/>
+          <w:color w:val="EB7A41"/>
+          <w:sz w:val="20"/>
+          <w:szCs w:val="20"/>
+        </w:rPr>
+        <w:t>        "answers": [</w:t>
+      </w:r>
+    </w:p>
+    <w:p>
+      <w:pPr>
+        <w:shd w:val="clear" w:color="auto" w:fill="000000" w:themeFill="text1"/>
+        <w:spacing w:after="0" w:line="240" w:lineRule="auto"/>
+        <w:rPr>
+          <w:rFonts w:ascii="Consolas" w:hAnsi="Consolas"/>
+          <w:color w:val="EB7A41"/>
+          <w:sz w:val="20"/>
+          <w:szCs w:val="20"/>
+        </w:rPr>
+      </w:pPr>
+      <w:r>
+        <w:rPr>
+          <w:rFonts w:ascii="Consolas" w:hAnsi="Consolas"/>
+          <w:color w:val="EB7A41"/>
+          <w:sz w:val="20"/>
+          <w:szCs w:val="20"/>
+        </w:rPr>
+        <w:t>        "Answer 1",</w:t>
+      </w:r>
+    </w:p>
+    <w:p>
+      <w:pPr>
+        <w:shd w:val="clear" w:color="auto" w:fill="000000" w:themeFill="text1"/>
+        <w:spacing w:after="0" w:line="240" w:lineRule="auto"/>
+        <w:rPr>
+          <w:rFonts w:ascii="Consolas" w:hAnsi="Consolas"/>
+          <w:color w:val="EB7A41"/>
+          <w:sz w:val="20"/>
+          <w:szCs w:val="20"/>
+        </w:rPr>
+      </w:pPr>
+      <w:r>
+        <w:rPr>
+          <w:rFonts w:ascii="Consolas" w:hAnsi="Consolas"/>
+          <w:color w:val="EB7A41"/>
+          <w:sz w:val="20"/>
+          <w:szCs w:val="20"/>
+        </w:rPr>
+        <w:t>        "Answer 2",</w:t>
+      </w:r>
+    </w:p>
+    <w:p>
+      <w:pPr>
+        <w:shd w:val="clear" w:color="auto" w:fill="000000" w:themeFill="text1"/>
+        <w:spacing w:after="0" w:line="240" w:lineRule="auto"/>
+        <w:rPr>
+          <w:rFonts w:ascii="Consolas" w:hAnsi="Consolas"/>
+          <w:color w:val="EB7A41"/>
+          <w:sz w:val="20"/>
+          <w:szCs w:val="20"/>
+        </w:rPr>
+      </w:pPr>
+      <w:r>
+        <w:rPr>
+          <w:rFonts w:ascii="Consolas" w:hAnsi="Consolas"/>
+          <w:color w:val="EB7A41"/>
+          <w:sz w:val="20"/>
+          <w:szCs w:val="20"/>
+        </w:rPr>
+        <w:t>        "Answer 3",</w:t>
+      </w:r>
+    </w:p>
+    <w:p>
+      <w:pPr>
+        <w:shd w:val="clear" w:color="auto" w:fill="000000" w:themeFill="text1"/>
+        <w:spacing w:after="0" w:line="240" w:lineRule="auto"/>
+        <w:rPr>
+          <w:rFonts w:ascii="Consolas" w:hAnsi="Consolas"/>
+          <w:color w:val="EB7A41"/>
+          <w:sz w:val="20"/>
+          <w:szCs w:val="20"/>
+        </w:rPr>
+      </w:pPr>
+      <w:r>
+        <w:rPr>
+          <w:rFonts w:ascii="Consolas" w:hAnsi="Consolas"/>
+          <w:color w:val="EB7A41"/>
+          <w:sz w:val="20"/>
+          <w:szCs w:val="20"/>
+        </w:rPr>
+        <w:t>        "Answer 4"</w:t>
+      </w:r>
+    </w:p>
+    <w:p>
+      <w:pPr>
+        <w:shd w:val="clear" w:color="auto" w:fill="000000" w:themeFill="text1"/>
+        <w:spacing w:after="0" w:line="240" w:lineRule="auto"/>
+        <w:rPr>
+          <w:rFonts w:ascii="Consolas" w:hAnsi="Consolas"/>
+          <w:color w:val="EB7A41"/>
+          <w:sz w:val="20"/>
+          <w:szCs w:val="20"/>
+        </w:rPr>
+      </w:pPr>
+      <w:r>
+        <w:rPr>
+          <w:rFonts w:ascii="Consolas" w:hAnsi="Consolas"/>
+          <w:color w:val="EB7A41"/>
+          <w:sz w:val="20"/>
+          <w:szCs w:val="20"/>
+        </w:rPr>
+        <w:t>        ],</w:t>
+      </w:r>
+    </w:p>
+    <w:p>
+      <w:pPr>
+        <w:shd w:val="clear" w:color="auto" w:fill="000000" w:themeFill="text1"/>
+        <w:spacing w:after="0" w:line="240" w:lineRule="auto"/>
+        <w:rPr>
+          <w:rFonts w:ascii="Consolas" w:hAnsi="Consolas"/>
+          <w:color w:val="EB7A41"/>
+          <w:sz w:val="20"/>
+          <w:szCs w:val="20"/>
+        </w:rPr>
+      </w:pPr>
+      <w:r>
+        <w:rPr>
+          <w:rFonts w:ascii="Consolas" w:hAnsi="Consolas"/>
+          <w:color w:val="EB7A41"/>
+          <w:sz w:val="20"/>
+          <w:szCs w:val="20"/>
+        </w:rPr>
+        <w:t>        "</w:t>
+      </w:r>
+      <w:proofErr w:type="spellStart"/>
+      <w:r>
+        <w:rPr>
+          <w:rFonts w:ascii="Consolas" w:hAnsi="Consolas"/>
+          <w:color w:val="EB7A41"/>
+          <w:sz w:val="20"/>
+          <w:szCs w:val="20"/>
+        </w:rPr>
+        <w:t>correctAns</w:t>
+      </w:r>
+      <w:proofErr w:type="spellEnd"/>
+      <w:r>
+        <w:rPr>
+          <w:rFonts w:ascii="Consolas" w:hAnsi="Consolas"/>
+          <w:color w:val="EB7A41"/>
+          <w:sz w:val="20"/>
+          <w:szCs w:val="20"/>
+        </w:rPr>
+        <w:t>": "The correct answer text here"</w:t>
+      </w:r>
+    </w:p>
+    <w:p>
+      <w:pPr>
+        <w:shd w:val="clear" w:color="auto" w:fill="000000" w:themeFill="text1"/>
+        <w:spacing w:after="0" w:line="240" w:lineRule="auto"/>
+        <w:rPr>
+          <w:rFonts w:ascii="Consolas" w:hAnsi="Consolas"/>
+          <w:color w:val="EB7A41"/>
+          <w:sz w:val="20"/>
+          <w:szCs w:val="20"/>
+        </w:rPr>
+      </w:pPr>
+      <w:r>
+        <w:rPr>
+          <w:rFonts w:ascii="Consolas" w:hAnsi="Consolas"/>
+          <w:color w:val="EB7A41"/>
+          <w:sz w:val="20"/>
+          <w:szCs w:val="20"/>
+        </w:rPr>
+        <w:t>    }</w:t>
+      </w:r>
+    </w:p>
+    <w:p>
+      <w:pPr>
+        <w:shd w:val="clear" w:color="auto" w:fill="000000" w:themeFill="text1"/>
+        <w:spacing w:after="0" w:line="240" w:lineRule="auto"/>
+        <w:rPr>
+          <w:rFonts w:ascii="Consolas" w:hAnsi="Consolas"/>
+          <w:color w:val="EB7A41"/>
+          <w:sz w:val="20"/>
+          <w:szCs w:val="20"/>
+        </w:rPr>
+      </w:pPr>
+      <w:r>
+        <w:rPr>
+          <w:rFonts w:ascii="Consolas" w:hAnsi="Consolas"/>
+          <w:color w:val="EB7A41"/>
+          <w:sz w:val="20"/>
+          <w:szCs w:val="20"/>
+        </w:rPr>
+        <w:t>    // continue with all questions in the same object</w:t>
+      </w:r>
+    </w:p>
+    <w:p>
+      <w:pPr>
+        <w:shd w:val="clear" w:color="auto" w:fill="000000" w:themeFill="text1"/>
+        <w:spacing w:after="0" w:line="240" w:lineRule="auto"/>
+        <w:rPr>
+          <w:rFonts w:ascii="Consolas" w:hAnsi="Consolas"/>
+          <w:color w:val="EB7A41"/>
+          <w:sz w:val="20"/>
+          <w:szCs w:val="20"/>
+        </w:rPr>
+      </w:pPr>
+      <w:r>
+        <w:rPr>
+          <w:rFonts w:ascii="Consolas" w:hAnsi="Consolas"/>
+          <w:color w:val="EB7A41"/>
+          <w:sz w:val="20"/>
+          <w:szCs w:val="20"/>
+        </w:rPr>
+        <w:t>    }</w:t>
+      </w:r>
+    </w:p>
+    <w:p>
+      <w:pPr>
+        <w:shd w:val="clear" w:color="auto" w:fill="000000" w:themeFill="text1"/>
+        <w:spacing w:after="0" w:line="240" w:lineRule="auto"/>
+        <w:rPr>
+          <w:rFonts w:ascii="Consolas" w:hAnsi="Consolas"/>
+          <w:color w:val="EB7A41"/>
+          <w:sz w:val="20"/>
+          <w:szCs w:val="20"/>
+        </w:rPr>
+      </w:pPr>
+    </w:p>
+    <w:p>
+      <w:pPr>
+        <w:shd w:val="clear" w:color="auto" w:fill="000000" w:themeFill="text1"/>
+        <w:spacing w:after="0" w:line="240" w:lineRule="auto"/>
+        <w:rPr>
+          <w:rFonts w:ascii="Consolas" w:hAnsi="Consolas"/>
+          <w:color w:val="EB7A41"/>
+          <w:sz w:val="20"/>
+          <w:szCs w:val="20"/>
+        </w:rPr>
+      </w:pPr>
+      <w:r>
+        <w:rPr>
+          <w:rFonts w:ascii="Consolas" w:hAnsi="Consolas"/>
+          <w:color w:val="EB7A41"/>
+          <w:sz w:val="20"/>
+          <w:szCs w:val="20"/>
+        </w:rPr>
+        <w:t>    Rules:</w:t>
+      </w:r>
+    </w:p>
+    <w:p>
+      <w:pPr>
+        <w:shd w:val="clear" w:color="auto" w:fill="000000" w:themeFill="text1"/>
+        <w:spacing w:after="0" w:line="240" w:lineRule="auto"/>
+        <w:rPr>
+          <w:rFonts w:ascii="Consolas" w:hAnsi="Consolas"/>
+          <w:color w:val="EB7A41"/>
+          <w:sz w:val="20"/>
+          <w:szCs w:val="20"/>
+        </w:rPr>
+      </w:pPr>
+      <w:r>
+        <w:rPr>
+          <w:rFonts w:ascii="Consolas" w:hAnsi="Consolas"/>
+          <w:color w:val="EB7A41"/>
+          <w:sz w:val="20"/>
+          <w:szCs w:val="20"/>
+        </w:rPr>
+        <w:t>    - Do not wrap each question inside a separate array or object.</w:t>
+      </w:r>
+    </w:p>
+    <w:p>
+      <w:pPr>
+        <w:shd w:val="clear" w:color="auto" w:fill="000000" w:themeFill="text1"/>
+        <w:spacing w:after="0" w:line="240" w:lineRule="auto"/>
+        <w:rPr>
+          <w:rFonts w:ascii="Consolas" w:hAnsi="Consolas"/>
+          <w:color w:val="EB7A41"/>
+          <w:sz w:val="20"/>
+          <w:szCs w:val="20"/>
+        </w:rPr>
+      </w:pPr>
+      <w:r>
+        <w:rPr>
+          <w:rFonts w:ascii="Consolas" w:hAnsi="Consolas"/>
+          <w:color w:val="EB7A41"/>
+          <w:sz w:val="20"/>
+          <w:szCs w:val="20"/>
+        </w:rPr>
+        <w:t>    - Use a single JSON object containing all questions keyed by their IDs ("0" to "7").</w:t>
+      </w:r>
+    </w:p>
+    <w:p>
+      <w:pPr>
+        <w:shd w:val="clear" w:color="auto" w:fill="000000" w:themeFill="text1"/>
+        <w:spacing w:after="0" w:line="240" w:lineRule="auto"/>
+        <w:rPr>
+          <w:rFonts w:ascii="Consolas" w:hAnsi="Consolas"/>
+          <w:color w:val="EB7A41"/>
+          <w:sz w:val="20"/>
+          <w:szCs w:val="20"/>
+        </w:rPr>
+      </w:pPr>
+      <w:r>
+        <w:rPr>
+          <w:rFonts w:ascii="Consolas" w:hAnsi="Consolas"/>
+          <w:color w:val="EB7A41"/>
+          <w:sz w:val="20"/>
+          <w:szCs w:val="20"/>
+        </w:rPr>
+        <w:lastRenderedPageBreak/>
+        <w:t>    - Each question must have four 'answers' and a '</w:t>
+      </w:r>
+      <w:proofErr w:type="spellStart"/>
+      <w:r>
+        <w:rPr>
+          <w:rFonts w:ascii="Consolas" w:hAnsi="Consolas"/>
+          <w:color w:val="EB7A41"/>
+          <w:sz w:val="20"/>
+          <w:szCs w:val="20"/>
+        </w:rPr>
+        <w:t>correctAns</w:t>
+      </w:r>
+      <w:proofErr w:type="spellEnd"/>
+      <w:r>
+        <w:rPr>
+          <w:rFonts w:ascii="Consolas" w:hAnsi="Consolas"/>
+          <w:color w:val="EB7A41"/>
+          <w:sz w:val="20"/>
+          <w:szCs w:val="20"/>
+        </w:rPr>
+        <w:t>'.</w:t>
+      </w:r>
+    </w:p>
+    <w:p>
+      <w:pPr>
+        <w:shd w:val="clear" w:color="auto" w:fill="000000" w:themeFill="text1"/>
+        <w:spacing w:after="0" w:line="240" w:lineRule="auto"/>
+        <w:rPr>
+          <w:rFonts w:ascii="Consolas" w:hAnsi="Consolas"/>
+          <w:color w:val="EB7A41"/>
+          <w:sz w:val="20"/>
+          <w:szCs w:val="20"/>
+        </w:rPr>
+      </w:pPr>
+      <w:r>
+        <w:rPr>
+          <w:rFonts w:ascii="Consolas" w:hAnsi="Consolas"/>
+          <w:color w:val="EB7A41"/>
+          <w:sz w:val="20"/>
+          <w:szCs w:val="20"/>
+        </w:rPr>
+        <w:t>    - Question IDs start at 0 and increment by 1.</w:t>
+      </w:r>
+    </w:p>
+    <w:p>
+      <w:pPr>
+        <w:shd w:val="clear" w:color="auto" w:fill="000000" w:themeFill="text1"/>
+        <w:spacing w:after="0" w:line="240" w:lineRule="auto"/>
+        <w:rPr>
+          <w:rFonts w:ascii="Consolas" w:hAnsi="Consolas"/>
+          <w:color w:val="EB7A41"/>
+          <w:sz w:val="20"/>
+          <w:szCs w:val="20"/>
+        </w:rPr>
+      </w:pPr>
+      <w:r>
+        <w:rPr>
+          <w:rFonts w:ascii="Consolas" w:hAnsi="Consolas"/>
+          <w:color w:val="EB7A41"/>
+          <w:sz w:val="20"/>
+          <w:szCs w:val="20"/>
+        </w:rPr>
+        <w:t>    - Only output valid JSON; no extra text.</w:t>
+      </w:r>
+    </w:p>
+    <w:p>
+      <w:pPr>
+        <w:shd w:val="clear" w:color="auto" w:fill="000000" w:themeFill="text1"/>
+        <w:spacing w:after="0" w:line="240" w:lineRule="auto"/>
+        <w:rPr>
+          <w:rFonts w:ascii="Consolas" w:hAnsi="Consolas"/>
+          <w:color w:val="EB7A41"/>
+          <w:sz w:val="20"/>
+          <w:szCs w:val="20"/>
+        </w:rPr>
+      </w:pPr>
+    </w:p>
+    <w:p>
+      <w:pPr>
+        <w:shd w:val="clear" w:color="auto" w:fill="000000" w:themeFill="text1"/>
+        <w:spacing w:after="0" w:line="240" w:lineRule="auto"/>
+        <w:rPr>
+          <w:rFonts w:ascii="Consolas" w:hAnsi="Consolas"/>
+          <w:color w:val="EB7A41"/>
+          <w:sz w:val="20"/>
+          <w:szCs w:val="20"/>
+        </w:rPr>
+      </w:pPr>
+      <w:r>
+        <w:rPr>
+          <w:rFonts w:ascii="Consolas" w:hAnsi="Consolas"/>
+          <w:color w:val="EB7A41"/>
+          <w:sz w:val="20"/>
+          <w:szCs w:val="20"/>
+        </w:rPr>
+        <w:t>    Topic:</w:t>
+      </w:r>
+      <w:r>
+        <w:rPr>
+          <w:rFonts w:ascii="Consolas" w:hAnsi="Consolas"/>
+          <w:color w:val="EB7A41"/>
+          <w:sz w:val="20"/>
+          <w:szCs w:val="20"/>
+        </w:rPr>
+        <w:t xml:space="preserve"> </w:t>
+      </w:r>
+      <w:r>
+        <w:rPr>
+          <w:rFonts w:ascii="Consolas" w:hAnsi="Consolas"/>
+          <w:color w:val="215E99" w:themeColor="text2" w:themeTint="BF"/>
+          <w:sz w:val="20"/>
+          <w:szCs w:val="20"/>
+        </w:rPr>
+        <w:t>${</w:t>
+      </w:r>
+      <w:r>
+        <w:rPr>
+          <w:rFonts w:ascii="Consolas" w:hAnsi="Consolas"/>
+          <w:color w:val="A5C9EB" w:themeColor="text2" w:themeTint="40"/>
+          <w:sz w:val="20"/>
+          <w:szCs w:val="20"/>
+        </w:rPr>
+        <w:t>topic</w:t>
+      </w:r>
+      <w:r>
+        <w:rPr>
+          <w:rFonts w:ascii="Consolas" w:hAnsi="Consolas"/>
+          <w:color w:val="215E99" w:themeColor="text2" w:themeTint="BF"/>
+          <w:sz w:val="20"/>
+          <w:szCs w:val="20"/>
+        </w:rPr>
+        <w:t>}</w:t>
+      </w:r>
+      <w:r>
+        <w:rPr>
+          <w:rFonts w:ascii="Consolas" w:hAnsi="Consolas"/>
+          <w:color w:val="EB7A41"/>
+          <w:sz w:val="20"/>
+          <w:szCs w:val="20"/>
+        </w:rPr>
+        <w:t>`</w:t>
+      </w:r>
+      <w:r>
+        <w:rPr>
+          <w:rFonts w:ascii="Consolas" w:hAnsi="Consolas"/>
+          <w:sz w:val="20"/>
+          <w:szCs w:val="20"/>
+        </w:rPr>
+        <w:t>.</w:t>
+      </w:r>
+      <w:r>
+        <w:rPr>
+          <w:rFonts w:ascii="Consolas" w:hAnsi="Consolas"/>
+          <w:color w:val="FFFF66"/>
+          <w:sz w:val="20"/>
+          <w:szCs w:val="20"/>
+        </w:rPr>
+        <w:t>trim</w:t>
+      </w:r>
+      <w:r>
+        <w:rPr>
+          <w:rFonts w:ascii="Consolas" w:hAnsi="Consolas"/>
+          <w:color w:val="215E99" w:themeColor="text2" w:themeTint="BF"/>
+          <w:sz w:val="20"/>
+          <w:szCs w:val="20"/>
+        </w:rPr>
+        <w:t>()</w:t>
+      </w:r>
+      <w:r>
+        <w:rPr>
+          <w:rFonts w:ascii="Consolas" w:hAnsi="Consolas"/>
+          <w:sz w:val="20"/>
+          <w:szCs w:val="20"/>
+        </w:rPr>
+        <w:t xml:space="preserve">; </w:t>
+      </w:r>
+    </w:p>
+    <w:p>
+      <w:pPr>
+        <w:rPr>
+          <w:rStyle w:val="SubtleEmphasis"/>
+        </w:rPr>
+      </w:pPr>
+      <w:r>
+        <w:rPr>
+          <w:rStyle w:val="SubtleEmphasis"/>
+        </w:rPr>
+        <w:t xml:space="preserve">Code1 </w:t>
+      </w:r>
+      <w:r>
+        <w:rPr>
+          <w:rStyle w:val="SubtleEmphasis"/>
+        </w:rPr>
+        <w:t>–</w:t>
+      </w:r>
+      <w:r>
+        <w:rPr>
+          <w:rStyle w:val="SubtleEmphasis"/>
+        </w:rPr>
+        <w:t xml:space="preserve"> </w:t>
+      </w:r>
+      <w:r>
+        <w:rPr>
+          <w:rStyle w:val="SubtleEmphasis"/>
+        </w:rPr>
+        <w:t>Base prompt fed to AI model</w:t>
+      </w:r>
+    </w:p>
+    <w:p>
+      <w:r>
+        <w:tab/>
+      </w:r>
+    </w:p>
+    <w:p>
+      <w:r>
+        <w:tab/>
+        <w:t xml:space="preserve">This has been refined over time to suit the </w:t>
+      </w:r>
+      <w:r>
+        <w:t xml:space="preserve">changing needs/scope of the project. </w:t>
+      </w:r>
+      <w:r>
+        <w:t xml:space="preserve">This is almost certainly still not perfect but </w:t>
+      </w:r>
+      <w:r>
+        <w:t>gave the most suitable responses for its purpose.</w:t>
+      </w:r>
+    </w:p>
+    <w:p/>
+    <w:p>
+      <w:pPr>
+        <w:pStyle w:val="Heading4"/>
+      </w:pPr>
+      <w:r>
+        <w:t xml:space="preserve">JSON </w:t>
+      </w:r>
+      <w:r>
+        <w:t>formatting</w:t>
+      </w:r>
+    </w:p>
+    <w:p>
+      <w:pPr>
+        <w:ind w:firstLine="720"/>
+      </w:pPr>
+      <w:r>
+        <w:t>Whilst the response given by the model ap</w:t>
+      </w:r>
+      <w:r>
+        <w:t xml:space="preserve">pears </w:t>
+      </w:r>
+      <w:r>
+        <w:t xml:space="preserve">to return with proper formatting initially; minor adjustments </w:t>
+      </w:r>
+      <w:r>
+        <w:t>must</w:t>
+      </w:r>
+      <w:r>
+        <w:t xml:space="preserve"> be made to </w:t>
+      </w:r>
+      <w:r>
+        <w:t xml:space="preserve">be in a valid JSON format. </w:t>
+      </w:r>
+      <w:r>
+        <w:t xml:space="preserve">This is </w:t>
+      </w:r>
+      <w:r>
+        <w:t>done using the following cleanup method:</w:t>
+      </w:r>
+    </w:p>
+    <w:p>
+      <w:pPr>
+        <w:shd w:val="clear" w:color="auto" w:fill="000000" w:themeFill="text1"/>
+        <w:spacing w:after="0" w:line="240" w:lineRule="auto"/>
+        <w:rPr>
+          <w:rFonts w:ascii="Consolas" w:hAnsi="Consolas"/>
+          <w:color w:val="EB7A41"/>
+          <w:sz w:val="20"/>
+          <w:szCs w:val="20"/>
+        </w:rPr>
+      </w:pPr>
+      <w:r>
+        <w:rPr>
+          <w:rFonts w:ascii="Consolas" w:hAnsi="Consolas"/>
+          <w:color w:val="EE0000"/>
+          <w:sz w:val="20"/>
+          <w:szCs w:val="20"/>
+        </w:rPr>
+        <w:t>c</w:t>
+      </w:r>
+      <w:r>
+        <w:rPr>
+          <w:rFonts w:ascii="Consolas" w:hAnsi="Consolas"/>
+          <w:color w:val="EE0000"/>
+          <w:sz w:val="20"/>
+          <w:szCs w:val="20"/>
+        </w:rPr>
+        <w:t xml:space="preserve">onst </w:t>
+      </w:r>
+      <w:r>
+        <w:rPr>
+          <w:rFonts w:ascii="Consolas" w:hAnsi="Consolas"/>
+          <w:color w:val="4C94D8" w:themeColor="text2" w:themeTint="80"/>
+          <w:sz w:val="20"/>
+          <w:szCs w:val="20"/>
+        </w:rPr>
+        <w:t xml:space="preserve">cleaned </w:t>
+      </w:r>
+      <w:r>
+        <w:rPr>
+          <w:rFonts w:ascii="Consolas" w:hAnsi="Consolas"/>
+          <w:color w:val="FFFFFF" w:themeColor="background1"/>
+          <w:sz w:val="20"/>
+          <w:szCs w:val="20"/>
+        </w:rPr>
+        <w:t>= fullResponse</w:t>
+      </w:r>
+    </w:p>
+    <w:p>
+      <w:pPr>
+        <w:shd w:val="clear" w:color="auto" w:fill="000000" w:themeFill="text1"/>
+        <w:spacing w:after="0" w:line="240" w:lineRule="auto"/>
+        <w:rPr>
+          <w:rFonts w:ascii="Consolas" w:hAnsi="Consolas"/>
+          <w:color w:val="EB7A41"/>
+          <w:sz w:val="20"/>
+          <w:szCs w:val="20"/>
+        </w:rPr>
+      </w:pPr>
+      <w:r>
+        <w:rPr>
+          <w:rFonts w:ascii="Consolas" w:hAnsi="Consolas"/>
+          <w:color w:val="EB7A41"/>
+          <w:sz w:val="20"/>
+          <w:szCs w:val="20"/>
+        </w:rPr>
+        <w:tab/>
+      </w:r>
+      <w:r>
+        <w:rPr>
+          <w:rFonts w:ascii="Consolas" w:hAnsi="Consolas"/>
+          <w:color w:val="FFFFFF" w:themeColor="background1"/>
+          <w:sz w:val="20"/>
+          <w:szCs w:val="20"/>
+        </w:rPr>
+        <w:t>.</w:t>
+      </w:r>
+      <w:r>
+        <w:rPr>
+          <w:rFonts w:ascii="Consolas" w:hAnsi="Consolas"/>
+          <w:color w:val="F2CEED" w:themeColor="accent5" w:themeTint="33"/>
+          <w:sz w:val="20"/>
+          <w:szCs w:val="20"/>
+        </w:rPr>
+        <w:t>replace</w:t>
+      </w:r>
+      <w:r>
+        <w:rPr>
+          <w:rFonts w:ascii="Consolas" w:hAnsi="Consolas"/>
+          <w:color w:val="D86DCB" w:themeColor="accent5" w:themeTint="99"/>
+          <w:sz w:val="20"/>
+          <w:szCs w:val="20"/>
+        </w:rPr>
+        <w:t>(</w:t>
+      </w:r>
+      <w:r>
+        <w:rPr>
+          <w:rFonts w:ascii="Consolas" w:hAnsi="Consolas"/>
+          <w:color w:val="60CAF3" w:themeColor="accent4" w:themeTint="99"/>
+          <w:sz w:val="20"/>
+          <w:szCs w:val="20"/>
+        </w:rPr>
+        <w:t>/</w:t>
+      </w:r>
+      <w:r>
+        <w:rPr>
+          <w:rFonts w:ascii="Consolas" w:hAnsi="Consolas"/>
+          <w:color w:val="B3E5A1" w:themeColor="accent6" w:themeTint="66"/>
+          <w:sz w:val="20"/>
+          <w:szCs w:val="20"/>
+        </w:rPr>
+        <w:t>\\</w:t>
+      </w:r>
+      <w:r>
+        <w:rPr>
+          <w:rFonts w:ascii="Consolas" w:hAnsi="Consolas"/>
+          <w:color w:val="60CAF3" w:themeColor="accent4" w:themeTint="99"/>
+          <w:sz w:val="20"/>
+          <w:szCs w:val="20"/>
+        </w:rPr>
+        <w:t>n/</w:t>
+      </w:r>
+      <w:r>
+        <w:rPr>
+          <w:rFonts w:ascii="Consolas" w:hAnsi="Consolas"/>
+          <w:color w:val="EE0000"/>
+          <w:sz w:val="20"/>
+          <w:szCs w:val="20"/>
+        </w:rPr>
+        <w:t>g</w:t>
+      </w:r>
+      <w:r>
+        <w:rPr>
+          <w:rFonts w:ascii="Consolas" w:hAnsi="Consolas"/>
+          <w:color w:val="60CAF3" w:themeColor="accent4" w:themeTint="99"/>
+          <w:sz w:val="20"/>
+          <w:szCs w:val="20"/>
+        </w:rPr>
+        <w:t>, “</w:t>
+      </w:r>
+      <w:r>
+        <w:rPr>
+          <w:rFonts w:ascii="Consolas" w:hAnsi="Consolas"/>
+          <w:color w:val="FFC000"/>
+          <w:sz w:val="20"/>
+          <w:szCs w:val="20"/>
+        </w:rPr>
+        <w:t>\n</w:t>
+      </w:r>
+      <w:r>
+        <w:rPr>
+          <w:rFonts w:ascii="Consolas" w:hAnsi="Consolas"/>
+          <w:color w:val="60CAF3" w:themeColor="accent4" w:themeTint="99"/>
+          <w:sz w:val="20"/>
+          <w:szCs w:val="20"/>
+        </w:rPr>
+        <w:t>”</w:t>
+      </w:r>
+      <w:r>
+        <w:rPr>
+          <w:rFonts w:ascii="Consolas" w:hAnsi="Consolas"/>
+          <w:color w:val="D86DCB" w:themeColor="accent5" w:themeTint="99"/>
+          <w:sz w:val="20"/>
+          <w:szCs w:val="20"/>
+        </w:rPr>
+        <w:t>)</w:t>
+      </w:r>
+    </w:p>
+    <w:p>
+      <w:pPr>
+        <w:shd w:val="clear" w:color="auto" w:fill="000000" w:themeFill="text1"/>
+        <w:spacing w:after="0" w:line="240" w:lineRule="auto"/>
+        <w:rPr>
+          <w:rFonts w:ascii="Consolas" w:hAnsi="Consolas"/>
+          <w:color w:val="EB7A41"/>
+          <w:sz w:val="20"/>
+          <w:szCs w:val="20"/>
+        </w:rPr>
+      </w:pPr>
+      <w:r>
+        <w:rPr>
+          <w:rFonts w:ascii="Consolas" w:hAnsi="Consolas"/>
+          <w:color w:val="EB7A41"/>
+          <w:sz w:val="20"/>
+          <w:szCs w:val="20"/>
+        </w:rPr>
+        <w:tab/>
+      </w:r>
+      <w:r>
+        <w:rPr>
+          <w:rFonts w:ascii="Consolas" w:hAnsi="Consolas"/>
+          <w:color w:val="FFFFFF" w:themeColor="background1"/>
+          <w:sz w:val="20"/>
+          <w:szCs w:val="20"/>
+        </w:rPr>
+        <w:t>.</w:t>
+      </w:r>
+      <w:r>
+        <w:rPr>
+          <w:rFonts w:ascii="Consolas" w:hAnsi="Consolas"/>
+          <w:color w:val="F2CEED" w:themeColor="accent5" w:themeTint="33"/>
+          <w:sz w:val="20"/>
+          <w:szCs w:val="20"/>
+        </w:rPr>
+        <w:t>replace</w:t>
+      </w:r>
+      <w:r>
+        <w:rPr>
+          <w:rFonts w:ascii="Consolas" w:hAnsi="Consolas"/>
+          <w:color w:val="D86DCB" w:themeColor="accent5" w:themeTint="99"/>
+          <w:sz w:val="20"/>
+          <w:szCs w:val="20"/>
+        </w:rPr>
+        <w:t>(</w:t>
+      </w:r>
+      <w:r>
+        <w:rPr>
+          <w:rFonts w:ascii="Consolas" w:hAnsi="Consolas"/>
+          <w:color w:val="60CAF3" w:themeColor="accent4" w:themeTint="99"/>
+          <w:sz w:val="20"/>
+          <w:szCs w:val="20"/>
+        </w:rPr>
+        <w:t>/```</w:t>
+      </w:r>
+      <w:proofErr w:type="spellStart"/>
+      <w:r>
+        <w:rPr>
+          <w:rFonts w:ascii="Consolas" w:hAnsi="Consolas"/>
+          <w:color w:val="60CAF3" w:themeColor="accent4" w:themeTint="99"/>
+          <w:sz w:val="20"/>
+          <w:szCs w:val="20"/>
+        </w:rPr>
+        <w:t>json</w:t>
+      </w:r>
+      <w:proofErr w:type="spellEnd"/>
+      <w:r>
+        <w:rPr>
+          <w:rFonts w:ascii="Consolas" w:hAnsi="Consolas"/>
+          <w:color w:val="60CAF3" w:themeColor="accent4" w:themeTint="99"/>
+          <w:sz w:val="20"/>
+          <w:szCs w:val="20"/>
+        </w:rPr>
+        <w:t>/</w:t>
+      </w:r>
+      <w:proofErr w:type="spellStart"/>
+      <w:r>
+        <w:rPr>
+          <w:rFonts w:ascii="Consolas" w:hAnsi="Consolas"/>
+          <w:color w:val="EE0000"/>
+          <w:sz w:val="20"/>
+          <w:szCs w:val="20"/>
+        </w:rPr>
+        <w:t>gi</w:t>
+      </w:r>
+      <w:proofErr w:type="spellEnd"/>
+      <w:r>
+        <w:rPr>
+          <w:rFonts w:ascii="Consolas" w:hAnsi="Consolas"/>
+          <w:color w:val="FFFFFF" w:themeColor="background1"/>
+          <w:sz w:val="20"/>
+          <w:szCs w:val="20"/>
+        </w:rPr>
+        <w:t>,</w:t>
+      </w:r>
+      <w:r>
+        <w:rPr>
+          <w:rFonts w:ascii="Consolas" w:hAnsi="Consolas"/>
+          <w:color w:val="EB7A41"/>
+          <w:sz w:val="20"/>
+          <w:szCs w:val="20"/>
+        </w:rPr>
+        <w:t xml:space="preserve"> </w:t>
+      </w:r>
+      <w:r>
+        <w:rPr>
+          <w:rFonts w:ascii="Consolas" w:hAnsi="Consolas"/>
+          <w:color w:val="60CAF3" w:themeColor="accent4" w:themeTint="99"/>
+          <w:sz w:val="20"/>
+          <w:szCs w:val="20"/>
+        </w:rPr>
+        <w:t>“”</w:t>
+      </w:r>
+      <w:r>
+        <w:rPr>
+          <w:rFonts w:ascii="Consolas" w:hAnsi="Consolas"/>
+          <w:color w:val="D86DCB" w:themeColor="accent5" w:themeTint="99"/>
+          <w:sz w:val="20"/>
+          <w:szCs w:val="20"/>
+        </w:rPr>
+        <w:t>)</w:t>
+      </w:r>
+    </w:p>
+    <w:p>
+      <w:pPr>
+        <w:shd w:val="clear" w:color="auto" w:fill="000000" w:themeFill="text1"/>
+        <w:spacing w:after="0" w:line="240" w:lineRule="auto"/>
+        <w:rPr>
+          <w:rFonts w:ascii="Consolas" w:hAnsi="Consolas"/>
+          <w:color w:val="EB7A41"/>
+          <w:sz w:val="20"/>
+          <w:szCs w:val="20"/>
+        </w:rPr>
+      </w:pPr>
+      <w:r>
+        <w:rPr>
+          <w:rFonts w:ascii="Consolas" w:hAnsi="Consolas"/>
+          <w:color w:val="EB7A41"/>
+          <w:sz w:val="20"/>
+          <w:szCs w:val="20"/>
+        </w:rPr>
+        <w:tab/>
+      </w:r>
+      <w:r>
+        <w:rPr>
+          <w:rFonts w:ascii="Consolas" w:hAnsi="Consolas"/>
+          <w:color w:val="FFFFFF" w:themeColor="background1"/>
+          <w:sz w:val="20"/>
+          <w:szCs w:val="20"/>
+        </w:rPr>
+        <w:t>.</w:t>
+      </w:r>
+      <w:r>
+        <w:rPr>
+          <w:rFonts w:ascii="Consolas" w:hAnsi="Consolas"/>
+          <w:color w:val="F2CEED" w:themeColor="accent5" w:themeTint="33"/>
+          <w:sz w:val="20"/>
+          <w:szCs w:val="20"/>
+        </w:rPr>
+        <w:t>replace</w:t>
+      </w:r>
+      <w:r>
+        <w:rPr>
+          <w:rFonts w:ascii="Consolas" w:hAnsi="Consolas"/>
+          <w:color w:val="D86DCB" w:themeColor="accent5" w:themeTint="99"/>
+          <w:sz w:val="20"/>
+          <w:szCs w:val="20"/>
+        </w:rPr>
+        <w:t>(</w:t>
+      </w:r>
+      <w:r>
+        <w:rPr>
+          <w:rFonts w:ascii="Consolas" w:hAnsi="Consolas"/>
+          <w:color w:val="60CAF3" w:themeColor="accent4" w:themeTint="99"/>
+          <w:sz w:val="20"/>
+          <w:szCs w:val="20"/>
+        </w:rPr>
+        <w:t>/</w:t>
+      </w:r>
+      <w:r>
+        <w:rPr>
+          <w:rFonts w:ascii="Consolas" w:hAnsi="Consolas"/>
+          <w:color w:val="60CAF3" w:themeColor="accent4" w:themeTint="99"/>
+          <w:sz w:val="20"/>
+          <w:szCs w:val="20"/>
+        </w:rPr>
+        <w:t>```</w:t>
+      </w:r>
+      <w:r>
+        <w:rPr>
+          <w:rFonts w:ascii="Consolas" w:hAnsi="Consolas"/>
+          <w:color w:val="60CAF3" w:themeColor="accent4" w:themeTint="99"/>
+          <w:sz w:val="20"/>
+          <w:szCs w:val="20"/>
+        </w:rPr>
+        <w:t>/</w:t>
+      </w:r>
+      <w:r>
+        <w:rPr>
+          <w:rFonts w:ascii="Consolas" w:hAnsi="Consolas"/>
+          <w:color w:val="EE0000"/>
+          <w:sz w:val="20"/>
+          <w:szCs w:val="20"/>
+        </w:rPr>
+        <w:t>g</w:t>
+      </w:r>
+      <w:r>
+        <w:rPr>
+          <w:rFonts w:ascii="Consolas" w:hAnsi="Consolas"/>
+          <w:color w:val="FFFFFF" w:themeColor="background1"/>
+          <w:sz w:val="20"/>
+          <w:szCs w:val="20"/>
+        </w:rPr>
+        <w:t>,</w:t>
+      </w:r>
+      <w:r>
+        <w:rPr>
+          <w:rFonts w:ascii="Consolas" w:hAnsi="Consolas"/>
+          <w:color w:val="EB7A41"/>
+          <w:sz w:val="20"/>
+          <w:szCs w:val="20"/>
+        </w:rPr>
+        <w:t xml:space="preserve"> </w:t>
+      </w:r>
+      <w:r>
+        <w:rPr>
+          <w:rFonts w:ascii="Consolas" w:hAnsi="Consolas"/>
+          <w:color w:val="60CAF3" w:themeColor="accent4" w:themeTint="99"/>
+          <w:sz w:val="20"/>
+          <w:szCs w:val="20"/>
+        </w:rPr>
+        <w:t>“”</w:t>
+      </w:r>
+      <w:r>
+        <w:rPr>
+          <w:rFonts w:ascii="Consolas" w:hAnsi="Consolas"/>
+          <w:color w:val="D86DCB" w:themeColor="accent5" w:themeTint="99"/>
+          <w:sz w:val="20"/>
+          <w:szCs w:val="20"/>
+        </w:rPr>
+        <w:t>)</w:t>
+      </w:r>
+    </w:p>
+    <w:p>
+      <w:pPr>
+        <w:shd w:val="clear" w:color="auto" w:fill="000000" w:themeFill="text1"/>
+        <w:spacing w:after="0" w:line="240" w:lineRule="auto"/>
+        <w:rPr>
+          <w:rFonts w:ascii="Consolas" w:hAnsi="Consolas"/>
+          <w:color w:val="EB7A41"/>
+          <w:sz w:val="20"/>
+          <w:szCs w:val="20"/>
+        </w:rPr>
+      </w:pPr>
+      <w:r>
+        <w:rPr>
+          <w:rFonts w:ascii="Consolas" w:hAnsi="Consolas"/>
+          <w:color w:val="EB7A41"/>
+          <w:sz w:val="20"/>
+          <w:szCs w:val="20"/>
+        </w:rPr>
+        <w:tab/>
+      </w:r>
+      <w:r>
+        <w:rPr>
+          <w:rFonts w:ascii="Consolas" w:hAnsi="Consolas"/>
+          <w:color w:val="FFFFFF" w:themeColor="background1"/>
+          <w:sz w:val="20"/>
+          <w:szCs w:val="20"/>
+        </w:rPr>
+        <w:t>.</w:t>
+      </w:r>
+      <w:r>
+        <w:rPr>
+          <w:rFonts w:ascii="Consolas" w:hAnsi="Consolas"/>
+          <w:color w:val="F2CEED" w:themeColor="accent5" w:themeTint="33"/>
+          <w:sz w:val="20"/>
+          <w:szCs w:val="20"/>
+        </w:rPr>
+        <w:t>trim</w:t>
+      </w:r>
+      <w:r>
+        <w:rPr>
+          <w:rFonts w:ascii="Consolas" w:hAnsi="Consolas"/>
+          <w:color w:val="D86DCB" w:themeColor="accent5" w:themeTint="99"/>
+          <w:sz w:val="20"/>
+          <w:szCs w:val="20"/>
+        </w:rPr>
+        <w:t>(</w:t>
+      </w:r>
+      <w:r>
+        <w:rPr>
+          <w:rFonts w:ascii="Consolas" w:hAnsi="Consolas"/>
+          <w:color w:val="D86DCB" w:themeColor="accent5" w:themeTint="99"/>
+          <w:sz w:val="20"/>
+          <w:szCs w:val="20"/>
+        </w:rPr>
+        <w:t>)</w:t>
+      </w:r>
+      <w:r>
+        <w:rPr>
+          <w:rFonts w:ascii="Consolas" w:hAnsi="Consolas"/>
+          <w:color w:val="FFFFFF" w:themeColor="background1"/>
+          <w:sz w:val="20"/>
+          <w:szCs w:val="20"/>
+        </w:rPr>
+        <w:t>;</w:t>
+      </w:r>
+    </w:p>
+    <w:p>
+      <w:pPr>
+        <w:rPr>
+          <w:rStyle w:val="SubtleEmphasis"/>
+        </w:rPr>
+      </w:pPr>
+      <w:r>
+        <w:rPr>
+          <w:rStyle w:val="SubtleEmphasis"/>
+        </w:rPr>
+        <w:t>Code2 – Response cleanup method</w:t>
+      </w:r>
+      <w:r>
+        <w:rPr>
+          <w:rStyle w:val="SubtleEmphasis"/>
+        </w:rPr>
+        <w:t xml:space="preserve"> 1</w:t>
+      </w:r>
+    </w:p>
+    <w:p>
+      <w:r>
+        <w:tab/>
+        <w:t xml:space="preserve">This is necessary to produce a </w:t>
+      </w:r>
+      <w:r>
+        <w:t>properly formatted JSON file.</w:t>
+      </w:r>
+      <w:r>
+        <w:t xml:space="preserve"> It essentially removes the bloating from the output. </w:t>
+      </w:r>
+      <w:r>
+        <w:t xml:space="preserve">This is achieved </w:t>
+      </w:r>
+      <w:r>
+        <w:t xml:space="preserve">through taking the entire output of the model – in the </w:t>
+      </w:r>
+      <w:r>
+        <w:t xml:space="preserve">‘fullResponse’ variable and putting it through a set of .replace() functions. </w:t>
+      </w:r>
+      <w:r>
+        <w:t xml:space="preserve">The first properly formats the line breaks in the </w:t>
+      </w:r>
+      <w:r>
+        <w:t xml:space="preserve">question set (from </w:t>
+      </w:r>
+      <w:hyperlink r:id="rId7" w:history="1">
+        <w:r>
+          <w:rPr>
+            <w:rStyle w:val="Hyperlink"/>
+          </w:rPr>
+          <w:t>\\n</w:t>
+        </w:r>
+      </w:hyperlink>
+      <w:r>
+        <w:t xml:space="preserve"> to \n). The seconds removes the </w:t>
+      </w:r>
+      <w:r>
+        <w:t xml:space="preserve">marker used at the end of the response </w:t>
+      </w:r>
+      <w:r>
+        <w:t>(</w:t>
+      </w:r>
+      <w:r>
+        <w:t>```</w:t>
+      </w:r>
+      <w:proofErr w:type="spellStart"/>
+      <w:r>
+        <w:t>json</w:t>
+      </w:r>
+      <w:proofErr w:type="spellEnd"/>
+      <w:r>
+        <w:t xml:space="preserve"> )</w:t>
+      </w:r>
+      <w:r>
+        <w:t xml:space="preserve"> </w:t>
+      </w:r>
+      <w:r>
+        <w:t xml:space="preserve">and replaces it with </w:t>
+      </w:r>
+      <w:r>
+        <w:t>a null value. The t</w:t>
+      </w:r>
+      <w:r>
+        <w:t xml:space="preserve">hird replicates the second but for the start of the response. Finaly, the </w:t>
+      </w:r>
+      <w:r>
+        <w:t xml:space="preserve">.trim() function removes any whitespace before or after </w:t>
+      </w:r>
+      <w:r>
+        <w:t>the text.</w:t>
+      </w:r>
+    </w:p>
+    <w:p>
+      <w:r>
+        <w:tab/>
+        <w:t>Moreover, I have implemented</w:t>
+      </w:r>
+      <w:r>
+        <w:t xml:space="preserve"> a few lines of code to remove unwanted text outside of the </w:t>
+      </w:r>
+      <w:r>
+        <w:t xml:space="preserve">defined question pack area (contained within the </w:t>
+      </w:r>
+      <w:r>
+        <w:t>first {}) using the following</w:t>
+      </w:r>
+      <w:r>
+        <w:t>:</w:t>
+      </w:r>
+    </w:p>
+    <w:p>
+      <w:pPr>
+        <w:shd w:val="clear" w:color="auto" w:fill="000000" w:themeFill="text1"/>
+        <w:spacing w:after="0" w:line="240" w:lineRule="auto"/>
+        <w:rPr>
+          <w:rFonts w:ascii="Consolas" w:hAnsi="Consolas"/>
+          <w:color w:val="EB7A41"/>
+          <w:sz w:val="20"/>
+          <w:szCs w:val="20"/>
+        </w:rPr>
+      </w:pPr>
+      <w:r>
+        <w:rPr>
+          <w:rFonts w:ascii="Consolas" w:hAnsi="Consolas"/>
+          <w:color w:val="EE0000"/>
+          <w:sz w:val="20"/>
+          <w:szCs w:val="20"/>
+        </w:rPr>
+        <w:t xml:space="preserve">const </w:t>
+      </w:r>
+      <w:r>
+        <w:rPr>
+          <w:rFonts w:ascii="Consolas" w:hAnsi="Consolas"/>
+          <w:color w:val="4C94D8" w:themeColor="text2" w:themeTint="80"/>
+          <w:sz w:val="20"/>
+          <w:szCs w:val="20"/>
+        </w:rPr>
+        <w:t xml:space="preserve">firstBrace </w:t>
+      </w:r>
+      <w:r>
+        <w:rPr>
+          <w:rFonts w:ascii="Consolas" w:hAnsi="Consolas"/>
+          <w:color w:val="FFFFFF" w:themeColor="background1"/>
+          <w:sz w:val="20"/>
+          <w:szCs w:val="20"/>
+        </w:rPr>
+        <w:t>=</w:t>
+      </w:r>
+      <w:r>
+        <w:rPr>
+          <w:rFonts w:ascii="Consolas" w:hAnsi="Consolas"/>
+          <w:color w:val="EB7A41"/>
+          <w:sz w:val="20"/>
+          <w:szCs w:val="20"/>
+        </w:rPr>
+        <w:t xml:space="preserve"> </w:t>
+      </w:r>
+      <w:r>
+        <w:rPr>
+          <w:rFonts w:ascii="Consolas" w:hAnsi="Consolas"/>
+          <w:color w:val="4C94D8" w:themeColor="text2" w:themeTint="80"/>
+          <w:sz w:val="20"/>
+          <w:szCs w:val="20"/>
+        </w:rPr>
+        <w:t>cleaned</w:t>
+      </w:r>
+      <w:r>
+        <w:rPr>
+          <w:rFonts w:ascii="Consolas" w:hAnsi="Consolas"/>
+          <w:color w:val="FFFFFF" w:themeColor="background1"/>
+          <w:sz w:val="20"/>
+          <w:szCs w:val="20"/>
+        </w:rPr>
+        <w:t>.</w:t>
+      </w:r>
+      <w:r>
+        <w:rPr>
+          <w:rFonts w:ascii="Consolas" w:hAnsi="Consolas"/>
+          <w:color w:val="F2CEED" w:themeColor="accent5" w:themeTint="33"/>
+          <w:sz w:val="20"/>
+          <w:szCs w:val="20"/>
+        </w:rPr>
+        <w:t>indexOf</w:t>
+      </w:r>
+      <w:r>
+        <w:rPr>
+          <w:rFonts w:ascii="Consolas" w:hAnsi="Consolas"/>
+          <w:color w:val="D86DCB" w:themeColor="accent5" w:themeTint="99"/>
+          <w:sz w:val="20"/>
+          <w:szCs w:val="20"/>
+        </w:rPr>
+        <w:t>(</w:t>
+      </w:r>
+      <w:r>
+        <w:rPr>
+          <w:rFonts w:ascii="Consolas" w:hAnsi="Consolas"/>
+          <w:color w:val="60CAF3" w:themeColor="accent4" w:themeTint="99"/>
+          <w:sz w:val="20"/>
+          <w:szCs w:val="20"/>
+        </w:rPr>
+        <w:t>"{"</w:t>
+      </w:r>
+      <w:r>
+        <w:rPr>
+          <w:rFonts w:ascii="Consolas" w:hAnsi="Consolas"/>
+          <w:color w:val="D86DCB" w:themeColor="accent5" w:themeTint="99"/>
+          <w:sz w:val="20"/>
+          <w:szCs w:val="20"/>
+        </w:rPr>
+        <w:t>)</w:t>
+      </w:r>
+      <w:r>
+        <w:rPr>
+          <w:rFonts w:ascii="Consolas" w:hAnsi="Consolas"/>
+          <w:color w:val="FFFFFF" w:themeColor="background1"/>
+          <w:sz w:val="20"/>
+          <w:szCs w:val="20"/>
+        </w:rPr>
+        <w:t>;</w:t>
+      </w:r>
+    </w:p>
+    <w:p>
+      <w:pPr>
+        <w:shd w:val="clear" w:color="auto" w:fill="000000" w:themeFill="text1"/>
+        <w:spacing w:after="0" w:line="240" w:lineRule="auto"/>
+        <w:rPr>
+          <w:rFonts w:ascii="Consolas" w:hAnsi="Consolas"/>
+          <w:color w:val="EB7A41"/>
+          <w:sz w:val="20"/>
+          <w:szCs w:val="20"/>
+        </w:rPr>
+      </w:pPr>
+      <w:r>
+        <w:rPr>
+          <w:rFonts w:ascii="Consolas" w:hAnsi="Consolas"/>
+          <w:color w:val="EE0000"/>
+          <w:sz w:val="20"/>
+          <w:szCs w:val="20"/>
+        </w:rPr>
+        <w:t xml:space="preserve">const </w:t>
+      </w:r>
+      <w:r>
+        <w:rPr>
+          <w:rFonts w:ascii="Consolas" w:hAnsi="Consolas"/>
+          <w:color w:val="4C94D8" w:themeColor="text2" w:themeTint="80"/>
+          <w:sz w:val="20"/>
+          <w:szCs w:val="20"/>
+        </w:rPr>
+        <w:t xml:space="preserve">lastBrace </w:t>
+      </w:r>
+      <w:r>
+        <w:rPr>
+          <w:rFonts w:ascii="Consolas" w:hAnsi="Consolas"/>
+          <w:color w:val="FFFFFF" w:themeColor="background1"/>
+          <w:sz w:val="20"/>
+          <w:szCs w:val="20"/>
+        </w:rPr>
+        <w:t>=</w:t>
+      </w:r>
+      <w:r>
+        <w:rPr>
+          <w:rFonts w:ascii="Consolas" w:hAnsi="Consolas"/>
+          <w:color w:val="EB7A41"/>
+          <w:sz w:val="20"/>
+          <w:szCs w:val="20"/>
+        </w:rPr>
+        <w:t xml:space="preserve"> </w:t>
+      </w:r>
+      <w:r>
+        <w:rPr>
+          <w:rFonts w:ascii="Consolas" w:hAnsi="Consolas"/>
+          <w:color w:val="4C94D8" w:themeColor="text2" w:themeTint="80"/>
+          <w:sz w:val="20"/>
+          <w:szCs w:val="20"/>
+        </w:rPr>
+        <w:t>cleaned</w:t>
+      </w:r>
+      <w:r>
+        <w:rPr>
+          <w:rFonts w:ascii="Consolas" w:hAnsi="Consolas"/>
+          <w:color w:val="FFFFFF" w:themeColor="background1"/>
+          <w:sz w:val="20"/>
+          <w:szCs w:val="20"/>
+        </w:rPr>
+        <w:t>.</w:t>
+      </w:r>
+      <w:r>
+        <w:rPr>
+          <w:rFonts w:ascii="Consolas" w:hAnsi="Consolas"/>
+          <w:color w:val="F2CEED" w:themeColor="accent5" w:themeTint="33"/>
+          <w:sz w:val="20"/>
+          <w:szCs w:val="20"/>
+        </w:rPr>
+        <w:t>lastIndexOf</w:t>
+      </w:r>
+      <w:r>
+        <w:rPr>
+          <w:rFonts w:ascii="Consolas" w:hAnsi="Consolas"/>
+          <w:color w:val="D86DCB" w:themeColor="accent5" w:themeTint="99"/>
+          <w:sz w:val="20"/>
+          <w:szCs w:val="20"/>
+        </w:rPr>
+        <w:t>(</w:t>
+      </w:r>
+      <w:r>
+        <w:rPr>
+          <w:rFonts w:ascii="Consolas" w:hAnsi="Consolas"/>
+          <w:color w:val="60CAF3" w:themeColor="accent4" w:themeTint="99"/>
+          <w:sz w:val="20"/>
+          <w:szCs w:val="20"/>
+        </w:rPr>
+        <w:t>"}"</w:t>
+      </w:r>
+      <w:r>
+        <w:rPr>
+          <w:rFonts w:ascii="Consolas" w:hAnsi="Consolas"/>
+          <w:color w:val="D86DCB" w:themeColor="accent5" w:themeTint="99"/>
+          <w:sz w:val="20"/>
+          <w:szCs w:val="20"/>
+        </w:rPr>
+        <w:t>)</w:t>
+      </w:r>
+      <w:r>
+        <w:rPr>
+          <w:rFonts w:ascii="Consolas" w:hAnsi="Consolas"/>
+          <w:color w:val="FFFFFF" w:themeColor="background1"/>
+          <w:sz w:val="20"/>
+          <w:szCs w:val="20"/>
+        </w:rPr>
+        <w:t>;</w:t>
+      </w:r>
+    </w:p>
+    <w:p>
+      <w:pPr>
+        <w:shd w:val="clear" w:color="auto" w:fill="000000" w:themeFill="text1"/>
+        <w:spacing w:after="0" w:line="240" w:lineRule="auto"/>
+        <w:rPr>
+          <w:rFonts w:ascii="Consolas" w:hAnsi="Consolas"/>
+          <w:color w:val="EB7A41"/>
+          <w:sz w:val="20"/>
+          <w:szCs w:val="20"/>
+        </w:rPr>
+      </w:pPr>
+      <w:r>
+        <w:rPr>
+          <w:rFonts w:ascii="Consolas" w:hAnsi="Consolas"/>
+          <w:color w:val="EE0000"/>
+          <w:sz w:val="20"/>
+          <w:szCs w:val="20"/>
+        </w:rPr>
+        <w:t xml:space="preserve">const </w:t>
+      </w:r>
+      <w:r>
+        <w:rPr>
+          <w:rFonts w:ascii="Consolas" w:hAnsi="Consolas"/>
+          <w:color w:val="4C94D8" w:themeColor="text2" w:themeTint="80"/>
+          <w:sz w:val="20"/>
+          <w:szCs w:val="20"/>
+        </w:rPr>
+        <w:t xml:space="preserve">jsonString </w:t>
+      </w:r>
+      <w:r>
+        <w:rPr>
+          <w:rFonts w:ascii="Consolas" w:hAnsi="Consolas"/>
+          <w:color w:val="FFFFFF" w:themeColor="background1"/>
+          <w:sz w:val="20"/>
+          <w:szCs w:val="20"/>
+        </w:rPr>
+        <w:t>=</w:t>
+      </w:r>
+      <w:r>
+        <w:rPr>
+          <w:rFonts w:ascii="Consolas" w:hAnsi="Consolas"/>
+          <w:color w:val="EB7A41"/>
+          <w:sz w:val="20"/>
+          <w:szCs w:val="20"/>
+        </w:rPr>
+        <w:t xml:space="preserve"> </w:t>
+      </w:r>
+      <w:r>
+        <w:rPr>
+          <w:rFonts w:ascii="Consolas" w:hAnsi="Consolas"/>
+          <w:color w:val="4C94D8" w:themeColor="text2" w:themeTint="80"/>
+          <w:sz w:val="20"/>
+          <w:szCs w:val="20"/>
+        </w:rPr>
+        <w:t>cleaned</w:t>
+      </w:r>
+      <w:r>
+        <w:rPr>
+          <w:rFonts w:ascii="Consolas" w:hAnsi="Consolas"/>
+          <w:color w:val="FFFFFF" w:themeColor="background1"/>
+          <w:sz w:val="20"/>
+          <w:szCs w:val="20"/>
+        </w:rPr>
+        <w:t>.</w:t>
+      </w:r>
+      <w:r>
+        <w:rPr>
+          <w:rFonts w:ascii="Consolas" w:hAnsi="Consolas"/>
+          <w:color w:val="F2CEED" w:themeColor="accent5" w:themeTint="33"/>
+          <w:sz w:val="20"/>
+          <w:szCs w:val="20"/>
+        </w:rPr>
+        <w:t>slice</w:t>
+      </w:r>
+      <w:r>
+        <w:rPr>
+          <w:rFonts w:ascii="Consolas" w:hAnsi="Consolas"/>
+          <w:color w:val="D86DCB" w:themeColor="accent5" w:themeTint="99"/>
+          <w:sz w:val="20"/>
+          <w:szCs w:val="20"/>
+        </w:rPr>
+        <w:t>(</w:t>
+      </w:r>
+      <w:r>
+        <w:rPr>
+          <w:rFonts w:ascii="Consolas" w:hAnsi="Consolas"/>
+          <w:color w:val="4C94D8" w:themeColor="text2" w:themeTint="80"/>
+          <w:sz w:val="20"/>
+          <w:szCs w:val="20"/>
+        </w:rPr>
+        <w:t>firstBrace</w:t>
+      </w:r>
+      <w:r>
+        <w:rPr>
+          <w:rFonts w:ascii="Consolas" w:hAnsi="Consolas"/>
+          <w:color w:val="FFFFFF" w:themeColor="background1"/>
+          <w:sz w:val="20"/>
+          <w:szCs w:val="20"/>
+        </w:rPr>
+        <w:t>,</w:t>
+      </w:r>
+      <w:r>
+        <w:rPr>
+          <w:rFonts w:ascii="Consolas" w:hAnsi="Consolas"/>
+          <w:color w:val="EB7A41"/>
+          <w:sz w:val="20"/>
+          <w:szCs w:val="20"/>
+        </w:rPr>
+        <w:t xml:space="preserve"> </w:t>
+      </w:r>
+      <w:r>
+        <w:rPr>
+          <w:rFonts w:ascii="Consolas" w:hAnsi="Consolas"/>
+          <w:color w:val="4C94D8" w:themeColor="text2" w:themeTint="80"/>
+          <w:sz w:val="20"/>
+          <w:szCs w:val="20"/>
+        </w:rPr>
+        <w:t xml:space="preserve">lastBrace </w:t>
+      </w:r>
+      <w:r>
+        <w:rPr>
+          <w:rFonts w:ascii="Consolas" w:hAnsi="Consolas"/>
+          <w:color w:val="FFFFFF" w:themeColor="background1"/>
+          <w:sz w:val="20"/>
+          <w:szCs w:val="20"/>
+        </w:rPr>
+        <w:t>+</w:t>
+      </w:r>
+      <w:r>
+        <w:rPr>
+          <w:rFonts w:ascii="Consolas" w:hAnsi="Consolas"/>
+          <w:color w:val="EB7A41"/>
+          <w:sz w:val="20"/>
+          <w:szCs w:val="20"/>
+        </w:rPr>
+        <w:t xml:space="preserve"> </w:t>
+      </w:r>
+      <w:r>
+        <w:rPr>
+          <w:rFonts w:ascii="Consolas" w:hAnsi="Consolas"/>
+          <w:color w:val="B3E5A1" w:themeColor="accent6" w:themeTint="66"/>
+          <w:sz w:val="20"/>
+          <w:szCs w:val="20"/>
+        </w:rPr>
+        <w:t>1</w:t>
+      </w:r>
+      <w:r>
+        <w:rPr>
+          <w:rFonts w:ascii="Consolas" w:hAnsi="Consolas"/>
+          <w:color w:val="D86DCB" w:themeColor="accent5" w:themeTint="99"/>
+          <w:sz w:val="20"/>
+          <w:szCs w:val="20"/>
+        </w:rPr>
+        <w:t>)</w:t>
+      </w:r>
+      <w:r>
+        <w:rPr>
+          <w:rFonts w:ascii="Consolas" w:hAnsi="Consolas"/>
+          <w:color w:val="FFFFFF" w:themeColor="background1"/>
+          <w:sz w:val="20"/>
+          <w:szCs w:val="20"/>
+        </w:rPr>
+        <w:t>;</w:t>
+      </w:r>
+    </w:p>
+    <w:p>
+      <w:pPr>
+        <w:rPr>
+          <w:i/>
+          <w:iCs/>
+          <w:color w:val="404040" w:themeColor="text1" w:themeTint="BF"/>
+        </w:rPr>
+      </w:pPr>
+      <w:r>
+        <w:rPr>
+          <w:rStyle w:val="SubtleEmphasis"/>
+        </w:rPr>
+        <w:t>Code</w:t>
+      </w:r>
+      <w:r>
+        <w:rPr>
+          <w:rStyle w:val="SubtleEmphasis"/>
+        </w:rPr>
+        <w:t>3</w:t>
+      </w:r>
+      <w:r>
+        <w:rPr>
+          <w:rStyle w:val="SubtleEmphasis"/>
+        </w:rPr>
+        <w:t xml:space="preserve"> – Response cleanup method</w:t>
+      </w:r>
+      <w:r>
+        <w:rPr>
+          <w:rStyle w:val="SubtleEmphasis"/>
+        </w:rPr>
+        <w:t xml:space="preserve"> 2</w:t>
+      </w:r>
+    </w:p>
+    <w:p>
+      <w:r>
+        <w:tab/>
+        <w:t>This is needed due to the nature of</w:t>
+      </w:r>
+      <w:r>
+        <w:t xml:space="preserve"> how</w:t>
+      </w:r>
+      <w:r>
+        <w:t xml:space="preserve"> current AI</w:t>
+      </w:r>
+      <w:r>
+        <w:t xml:space="preserve"> responds with data</w:t>
+      </w:r>
+      <w:r>
+        <w:t>.</w:t>
+      </w:r>
+      <w:r>
+        <w:t xml:space="preserve"> Despite the prompt indicating that it should only </w:t>
+      </w:r>
+      <w:r>
+        <w:t>a valid JSON format, issues surrounding the e</w:t>
+      </w:r>
+      <w:r>
+        <w:t>xact structure remained problematic upon every response I was given, hence the implementation of the cleanups.</w:t>
+      </w:r>
+    </w:p>
+    <w:p/>
+    <w:p>
+      <w:pPr>
+        <w:pStyle w:val="Heading4"/>
+      </w:pPr>
+      <w:r>
+        <w:lastRenderedPageBreak/>
+        <w:t xml:space="preserve">File </w:t>
+      </w:r>
+      <w:r>
+        <w:t>handling</w:t>
+      </w:r>
+    </w:p>
+    <w:p/>
+    <w:p/>
+    <w:p>
+      <w:pPr>
         <w:pStyle w:val="Heading1"/>
       </w:pPr>
-      <w:bookmarkStart w:id="4" w:name="_Toc227666175"/>
+      <w:bookmarkStart w:id="7" w:name="_Toc227768085"/>
       <w:r>
         <w:t>Quality Assurance</w:t>
       </w:r>
-      <w:bookmarkEnd w:id="4"/>
+      <w:bookmarkEnd w:id="7"/>
     </w:p>
     <w:p>
       <w:pPr>
@@ -1046,9 +3635,11 @@
           <w:numId w:val="5"/>
         </w:numPr>
       </w:pPr>
+      <w:proofErr w:type="spellStart"/>
       <w:r>
         <w:t>Questionaires</w:t>
       </w:r>
+      <w:proofErr w:type="spellEnd"/>
     </w:p>
     <w:p>
       <w:pPr>
@@ -1058,9 +3649,13 @@
           <w:numId w:val="5"/>
         </w:numPr>
       </w:pPr>
-      <w:r>
-        <w:lastRenderedPageBreak/>
-        <w:t>Doccumentation on unit test</w:t>
+      <w:proofErr w:type="spellStart"/>
+      <w:r>
+        <w:t>Doccumentation</w:t>
+      </w:r>
+      <w:proofErr w:type="spellEnd"/>
+      <w:r>
+        <w:t xml:space="preserve"> on unit test</w:t>
       </w:r>
     </w:p>
     <w:p>
@@ -1117,11 +3712,11 @@
       <w:pPr>
         <w:pStyle w:val="Heading1"/>
       </w:pPr>
-      <w:bookmarkStart w:id="5" w:name="_Toc227666176"/>
+      <w:bookmarkStart w:id="8" w:name="_Toc227768086"/>
       <w:r>
         <w:t>Conclusion</w:t>
       </w:r>
-      <w:bookmarkEnd w:id="5"/>
+      <w:bookmarkEnd w:id="8"/>
     </w:p>
     <w:p>
       <w:pPr>
@@ -1153,11 +3748,11 @@
       <w:pPr>
         <w:pStyle w:val="Heading1"/>
       </w:pPr>
-      <w:bookmarkStart w:id="6" w:name="_Toc227666177"/>
+      <w:bookmarkStart w:id="9" w:name="_Toc227768087"/>
       <w:r>
         <w:t>References</w:t>
       </w:r>
-      <w:bookmarkEnd w:id="6"/>
+      <w:bookmarkEnd w:id="9"/>
     </w:p>
     <w:p>
       <w:pPr>
@@ -1177,11 +3772,11 @@
       <w:pPr>
         <w:pStyle w:val="Heading1"/>
       </w:pPr>
-      <w:bookmarkStart w:id="7" w:name="_Toc227666178"/>
+      <w:bookmarkStart w:id="10" w:name="_Toc227768088"/>
       <w:r>
         <w:t>Appendix</w:t>
       </w:r>
-      <w:bookmarkEnd w:id="7"/>
+      <w:bookmarkEnd w:id="10"/>
     </w:p>
     <w:p>
       <w:pPr>
@@ -1192,7 +3787,15 @@
         </w:numPr>
       </w:pPr>
       <w:r>
-        <w:t>The 1000 word CW submission evidence and evaluation file for each member (does not count towards page limit)</w:t>
+        <w:t xml:space="preserve">The </w:t>
+      </w:r>
+      <w:proofErr w:type="gramStart"/>
+      <w:r>
+        <w:t>1000 word</w:t>
+      </w:r>
+      <w:proofErr w:type="gramEnd"/>
+      <w:r>
+        <w:t xml:space="preserve"> CW submission evidence and evaluation file for each member (does not count towards page limit)</w:t>
       </w:r>
     </w:p>
     <w:p/>
@@ -2531,6 +5134,7 @@
   <w:style w:type="paragraph" w:default="1" w:styleId="Normal">
     <w:name w:val="Normal"/>
     <w:qFormat/>
+    <w:rsid w:val="006C2CC3"/>
   </w:style>
   <w:style w:type="paragraph" w:styleId="Heading1">
     <w:name w:val="heading 1"/>
@@ -2581,7 +5185,6 @@
     <w:next w:val="Normal"/>
     <w:link w:val="Heading3Char"/>
     <w:uiPriority w:val="9"/>
-    <w:semiHidden/>
     <w:unhideWhenUsed/>
     <w:qFormat/>
     <w:rsid w:val="001220AA"/>
@@ -2604,7 +5207,6 @@
     <w:next w:val="Normal"/>
     <w:link w:val="Heading4Char"/>
     <w:uiPriority w:val="9"/>
-    <w:semiHidden/>
     <w:unhideWhenUsed/>
     <w:qFormat/>
     <w:rsid w:val="001220AA"/>
@@ -2733,7 +5335,6 @@
   <w:style w:type="character" w:default="1" w:styleId="DefaultParagraphFont">
     <w:name w:val="Default Paragraph Font"/>
     <w:uiPriority w:val="1"/>
-    <w:semiHidden/>
     <w:unhideWhenUsed/>
   </w:style>
   <w:style w:type="table" w:default="1" w:styleId="TableNormal">
@@ -2788,7 +5389,6 @@
     <w:basedOn w:val="DefaultParagraphFont"/>
     <w:link w:val="Heading3"/>
     <w:uiPriority w:val="9"/>
-    <w:semiHidden/>
     <w:rsid w:val="001220AA"/>
     <w:rPr>
       <w:rFonts w:eastAsiaTheme="majorEastAsia" w:cstheme="majorBidi"/>
@@ -2802,7 +5402,6 @@
     <w:basedOn w:val="DefaultParagraphFont"/>
     <w:link w:val="Heading4"/>
     <w:uiPriority w:val="9"/>
-    <w:semiHidden/>
     <w:rsid w:val="001220AA"/>
     <w:rPr>
       <w:rFonts w:eastAsiaTheme="majorEastAsia" w:cstheme="majorBidi"/>
@@ -3087,6 +5686,56 @@
     <w:rPr>
       <w:color w:val="467886" w:themeColor="hyperlink"/>
       <w:u w:val="single"/>
+    </w:rPr>
+  </w:style>
+  <w:style w:type="paragraph" w:styleId="TOC2">
+    <w:name w:val="toc 2"/>
+    <w:basedOn w:val="Normal"/>
+    <w:next w:val="Normal"/>
+    <w:autoRedefine/>
+    <w:uiPriority w:val="39"/>
+    <w:unhideWhenUsed/>
+    <w:rsid w:val="00116158"/>
+    <w:pPr>
+      <w:spacing w:after="100"/>
+      <w:ind w:left="240"/>
+    </w:pPr>
+  </w:style>
+  <w:style w:type="paragraph" w:styleId="TOC3">
+    <w:name w:val="toc 3"/>
+    <w:basedOn w:val="Normal"/>
+    <w:next w:val="Normal"/>
+    <w:autoRedefine/>
+    <w:uiPriority w:val="39"/>
+    <w:unhideWhenUsed/>
+    <w:rsid w:val="00116158"/>
+    <w:pPr>
+      <w:spacing w:after="100"/>
+      <w:ind w:left="480"/>
+    </w:pPr>
+  </w:style>
+  <w:style w:type="character" w:styleId="SubtleEmphasis">
+    <w:name w:val="Subtle Emphasis"/>
+    <w:basedOn w:val="DefaultParagraphFont"/>
+    <w:uiPriority w:val="19"/>
+    <w:qFormat/>
+    <w:rsid w:val="00271285"/>
+    <w:rPr>
+      <w:i/>
+      <w:iCs/>
+      <w:color w:val="404040" w:themeColor="text1" w:themeTint="BF"/>
+    </w:rPr>
+  </w:style>
+  <w:style w:type="character" w:styleId="UnresolvedMention">
+    <w:name w:val="Unresolved Mention"/>
+    <w:basedOn w:val="DefaultParagraphFont"/>
+    <w:uiPriority w:val="99"/>
+    <w:semiHidden/>
+    <w:unhideWhenUsed/>
+    <w:rsid w:val="00C426EA"/>
+    <w:rPr>
+      <w:color w:val="605E5C"/>
+      <w:shd w:val="clear" w:color="auto" w:fill="E1DFDD"/>
     </w:rPr>
   </w:style>
 </w:styles>

</xml_diff>